<commit_message>
Agregamos todos los archivos del taller
</commit_message>
<xml_diff>
--- a/docs/documentos/reporte.docx
+++ b/docs/documentos/reporte.docx
@@ -1,220 +1,420 @@
 
 <file path=word/document.xml><?xml version="1.0" encoding="utf-8"?>
-<w:document xmlns:w="http://schemas.openxmlformats.org/wordprocessingml/2006/main" xmlns:m="http://schemas.openxmlformats.org/officeDocument/2006/math" xmlns:r="http://schemas.openxmlformats.org/officeDocument/2006/relationships" xmlns:o="urn:schemas-microsoft-com:office:office" xmlns:v="urn:schemas-microsoft-com:vml" xmlns:w10="urn:schemas-microsoft-com:office:word" xmlns:a="http://schemas.openxmlformats.org/drawingml/2006/main" xmlns:pic="http://schemas.openxmlformats.org/drawingml/2006/picture" xmlns:wp="http://schemas.openxmlformats.org/drawingml/2006/wordprocessingDrawing">
+<w:document xmlns:o="urn:schemas-microsoft-com:office:office" xmlns:r="http://schemas.openxmlformats.org/officeDocument/2006/relationships" xmlns:v="urn:schemas-microsoft-com:vml" xmlns:w="http://schemas.openxmlformats.org/wordprocessingml/2006/main" xmlns:w10="urn:schemas-microsoft-com:office:word" xmlns:wp="http://schemas.openxmlformats.org/drawingml/2006/wordprocessingDrawing" xmlns:pic="http://schemas.openxmlformats.org/drawingml/2006/picture" xmlns:wps="http://schemas.microsoft.com/office/word/2010/wordprocessingShape" xmlns:wpg="http://schemas.microsoft.com/office/word/2010/wordprocessingGroup" xmlns:mc="http://schemas.openxmlformats.org/markup-compatibility/2006" xmlns:wp14="http://schemas.microsoft.com/office/word/2010/wordprocessingDrawing" xmlns:w14="http://schemas.microsoft.com/office/word/2010/wordml" xmlns:w15="http://schemas.microsoft.com/office/word/2012/wordml" mc:Ignorable="w14 wp14 w15">
   <w:body>
     <w:p>
       <w:pPr>
         <w:pStyle w:val="Title"/>
+        <w:rPr/>
       </w:pPr>
       <w:r>
-        <w:t xml:space="preserve">Un Lindo Reporte Ficticio</w:t>
+        <w:rPr/>
+        <w:t>Un Lindo Reporte Ficticio</w:t>
       </w:r>
     </w:p>
     <w:p>
       <w:pPr>
         <w:pStyle w:val="Author"/>
+        <w:rPr/>
       </w:pPr>
       <w:r>
-        <w:t xml:space="preserve">Renato Vargas</w:t>
+        <w:rPr/>
+        <w:t>Renato Vargas</w:t>
       </w:r>
     </w:p>
     <w:sdt>
       <w:sdtPr>
         <w:docPartObj>
           <w:docPartGallery w:val="Table of Contents"/>
-          <w:docPartUnique/>
+          <w:docPartUnique w:val="true"/>
         </w:docPartObj>
       </w:sdtPr>
       <w:sdtContent>
         <w:p>
           <w:pPr>
             <w:pStyle w:val="TOCHeading"/>
+            <w:rPr/>
           </w:pPr>
           <w:r>
-            <w:t xml:space="preserve">Tabla de contenidos</w:t>
+            <w:rPr/>
+            <w:t>Tabla de contenidos</w:t>
           </w:r>
         </w:p>
         <w:p>
+          <w:pPr>
+            <w:pStyle w:val="TOC1"/>
+            <w:tabs>
+              <w:tab w:val="clear" w:pos="720"/>
+              <w:tab w:val="right" w:pos="9359" w:leader="dot"/>
+            </w:tabs>
+            <w:rPr/>
+          </w:pPr>
           <w:r>
-            <w:fldChar w:fldCharType="begin" w:dirty="true"/>
-            <w:instrText xml:space="preserve">TOC \o "1-3" \h \z \u</w:instrText>
+            <w:fldChar w:fldCharType="begin"/>
+          </w:r>
+          <w:r>
+            <w:rPr>
+              <w:rStyle w:val="IndexLink"/>
+              <w:webHidden/>
+            </w:rPr>
+            <w:instrText xml:space="preserve"> TOC \z \o "1-3" \u \h</w:instrText>
+          </w:r>
+          <w:r>
+            <w:rPr>
+              <w:rStyle w:val="IndexLink"/>
+              <w:webHidden/>
+            </w:rPr>
             <w:fldChar w:fldCharType="separate"/>
+          </w:r>
+          <w:hyperlink w:anchor="__RefHeading___Toc161_3134648260" w:tooltip="1. Introducción">
+            <w:r>
+              <w:rPr>
+                <w:rStyle w:val="IndexLink"/>
+                <w:webHidden/>
+              </w:rPr>
+              <w:t>1. Introducción</w:t>
+              <w:tab/>
+              <w:t>1</w:t>
+            </w:r>
+          </w:hyperlink>
+        </w:p>
+        <w:p>
+          <w:pPr>
+            <w:pStyle w:val="TOC1"/>
+            <w:tabs>
+              <w:tab w:val="clear" w:pos="720"/>
+              <w:tab w:val="right" w:pos="9359" w:leader="dot"/>
+            </w:tabs>
+            <w:rPr/>
+          </w:pPr>
+          <w:hyperlink w:anchor="__RefHeading___Toc163_3134648260" w:tooltip="2. Metodología">
+            <w:r>
+              <w:rPr>
+                <w:rStyle w:val="IndexLink"/>
+                <w:webHidden/>
+              </w:rPr>
+              <w:t>2. Metodología</w:t>
+              <w:tab/>
+              <w:t>1</w:t>
+            </w:r>
+          </w:hyperlink>
+        </w:p>
+        <w:p>
+          <w:pPr>
+            <w:pStyle w:val="TOC1"/>
+            <w:tabs>
+              <w:tab w:val="clear" w:pos="720"/>
+              <w:tab w:val="right" w:pos="9359" w:leader="dot"/>
+            </w:tabs>
+            <w:rPr/>
+          </w:pPr>
+          <w:hyperlink w:anchor="__RefHeading___Toc165_3134648260" w:tooltip="3. Resultados">
+            <w:r>
+              <w:rPr>
+                <w:rStyle w:val="IndexLink"/>
+                <w:webHidden/>
+              </w:rPr>
+              <w:t>3. Resultados</w:t>
+              <w:tab/>
+              <w:t>2</w:t>
+            </w:r>
+          </w:hyperlink>
+        </w:p>
+        <w:p>
+          <w:pPr>
+            <w:pStyle w:val="TOC1"/>
+            <w:tabs>
+              <w:tab w:val="clear" w:pos="720"/>
+              <w:tab w:val="right" w:pos="9359" w:leader="dot"/>
+            </w:tabs>
+            <w:rPr/>
+          </w:pPr>
+          <w:hyperlink w:anchor="__RefHeading___Toc167_3134648260" w:tooltip="4. Desempeño económico">
+            <w:r>
+              <w:rPr>
+                <w:rStyle w:val="IndexLink"/>
+                <w:webHidden/>
+              </w:rPr>
+              <w:t>4. Desempeño económico</w:t>
+              <w:tab/>
+              <w:t>2</w:t>
+            </w:r>
+          </w:hyperlink>
+        </w:p>
+        <w:p>
+          <w:pPr>
+            <w:pStyle w:val="TOC2"/>
+            <w:tabs>
+              <w:tab w:val="clear" w:pos="720"/>
+              <w:tab w:val="right" w:pos="9359" w:leader="dot"/>
+            </w:tabs>
+            <w:rPr/>
+          </w:pPr>
+          <w:hyperlink w:anchor="__RefHeading___Toc169_3134648260" w:tooltip="4.1 Una mirada a la naturaleza">
+            <w:r>
+              <w:rPr>
+                <w:rStyle w:val="IndexLink"/>
+                <w:webHidden/>
+              </w:rPr>
+              <w:t>4.1 Una mirada a la naturaleza</w:t>
+              <w:tab/>
+              <w:t>2</w:t>
+            </w:r>
+          </w:hyperlink>
+        </w:p>
+        <w:p>
+          <w:pPr>
+            <w:pStyle w:val="TOC2"/>
+            <w:tabs>
+              <w:tab w:val="clear" w:pos="720"/>
+              <w:tab w:val="right" w:pos="9359" w:leader="dot"/>
+            </w:tabs>
+            <w:rPr/>
+          </w:pPr>
+          <w:hyperlink w:anchor="__RefHeading___Toc171_3134648260" w:tooltip="4.2 La perspectiva geográfica">
+            <w:r>
+              <w:rPr>
+                <w:rStyle w:val="IndexLink"/>
+                <w:webHidden/>
+              </w:rPr>
+              <w:t>4.2 La perspectiva geográfica</w:t>
+              <w:tab/>
+              <w:t>3</w:t>
+            </w:r>
+          </w:hyperlink>
+        </w:p>
+        <w:p>
+          <w:pPr>
+            <w:pStyle w:val="TOC1"/>
+            <w:tabs>
+              <w:tab w:val="clear" w:pos="720"/>
+              <w:tab w:val="right" w:pos="9359" w:leader="dot"/>
+            </w:tabs>
+            <w:rPr/>
+          </w:pPr>
+          <w:hyperlink w:anchor="__RefHeading___Toc173_3134648260" w:tooltip="5. Conclusiones">
+            <w:r>
+              <w:rPr>
+                <w:rStyle w:val="IndexLink"/>
+                <w:webHidden/>
+              </w:rPr>
+              <w:t>5. Conclusiones</w:t>
+              <w:tab/>
+              <w:t>4</w:t>
+            </w:r>
+          </w:hyperlink>
+        </w:p>
+        <w:p>
+          <w:pPr>
+            <w:pStyle w:val="TOC2"/>
+            <w:tabs>
+              <w:tab w:val="clear" w:pos="720"/>
+              <w:tab w:val="right" w:pos="9359" w:leader="dot"/>
+            </w:tabs>
+            <w:rPr/>
+          </w:pPr>
+          <w:hyperlink w:anchor="__RefHeading___Toc175_3134648260" w:tooltip="Referencias">
+            <w:r>
+              <w:rPr>
+                <w:rStyle w:val="IndexLink"/>
+                <w:webHidden/>
+              </w:rPr>
+              <w:t>Referencias</w:t>
+              <w:tab/>
+              <w:t>4</w:t>
+            </w:r>
+          </w:hyperlink>
+          <w:r>
+            <w:rPr>
+              <w:rStyle w:val="IndexLink"/>
+            </w:rPr>
             <w:fldChar w:fldCharType="end"/>
           </w:r>
         </w:p>
       </w:sdtContent>
     </w:sdt>
-    <w:bookmarkStart w:id="13" w:name="introducción"/>
     <w:p>
       <w:pPr>
         <w:pStyle w:val="Heading1"/>
+        <w:rPr/>
       </w:pPr>
-      <w:r>
-        <w:t xml:space="preserve">1. Introducción</w:t>
+      <w:bookmarkStart w:id="0" w:name="__RefHeading___Toc161_3134648260"/>
+      <w:bookmarkStart w:id="1" w:name="introducción"/>
+      <w:bookmarkEnd w:id="0"/>
+      <w:r>
+        <w:rPr/>
+        <w:t>1. Introducción</w:t>
       </w:r>
     </w:p>
     <w:p>
       <w:pPr>
         <w:pStyle w:val="FirstParagraph"/>
+        <w:rPr/>
       </w:pPr>
       <w:r>
-        <w:t xml:space="preserve">El crecimiento económico de los países centroamericanos ha estado marcado en los últimos años por una combinación de choques externos y procesos de recuperación pospandemia, lo cual hace relevante contar con ejercicios periódicos de seguimiento estadístico. Panamá en particular ha mostrado un desempeño singular dentro de la región debido a su condición de economía de servicios y centro logístico, por lo que este reporte ficticio ilustra, a manera de ejemplo, cómo se documentaría un análisis reproducible que combina fuentes de datos internacionales, ejercicios de clasificación biológica y datos geoespaciales dentro de un mismo documento de Quarto.</w:t>
-      </w:r>
+        <w:rPr/>
+        <w:t>El crecimiento económico de los países centroamericanos ha estado marcado en los últimos años por una combinación de choques externos y procesos de recuperación pospandemia, lo cual hace relevante contar con ejercicios periódicos de seguimiento estadístico. Panamá en particular ha mostrado un desempeño singular dentro de la región debido a su condición de economía de servicios y centro logístico, por lo que este reporte ficticio ilustra, a manera de ejemplo, cómo se documentaría un análisis reproducible que combina fuentes de datos internacionales, ejercicios de clasificación biológica y datos geoespaciales dentro de un mismo documento de Quarto.</w:t>
+      </w:r>
+      <w:bookmarkEnd w:id="1"/>
     </w:p>
-    <w:bookmarkEnd w:id="13"/>
-    <w:bookmarkStart w:id="14" w:name="metodología"/>
     <w:p>
       <w:pPr>
         <w:pStyle w:val="Heading1"/>
+        <w:rPr/>
       </w:pPr>
-      <w:r>
-        <w:t xml:space="preserve">2. Metodología</w:t>
+      <w:bookmarkStart w:id="2" w:name="__RefHeading___Toc163_3134648260"/>
+      <w:bookmarkStart w:id="3" w:name="metodología"/>
+      <w:bookmarkEnd w:id="2"/>
+      <w:r>
+        <w:rPr/>
+        <w:t>2. Metodología</w:t>
       </w:r>
     </w:p>
     <w:p>
       <w:pPr>
         <w:pStyle w:val="FirstParagraph"/>
+        <w:rPr/>
       </w:pPr>
       <w:r>
-        <w:t xml:space="preserve">Para efectos de este ejercicio se combinaron tres fuentes de datos de naturaleza distinta con el único propósito de demostrar capacidades de reproducibilidad y no de sustentar un análisis económico real. En primer lugar, se descargaron series del Producto Interno Bruto de Panamá directamente desde la API del Banco Mundial (</w:t>
+        <w:rPr/>
+        <w:t>Para efectos de este ejercicio se combinaron tres fuentes de datos de naturaleza distinta con el único propósito de demostrar capacidades de reproducibilidad y no de sustentar un análisis económico real. En primer lugar, se descargaron series del Producto Interno Bruto de Panamá directamente desde la API del Banco Mundial (</w:t>
       </w:r>
       <w:r>
         <w:rPr>
           <w:i/>
           <w:iCs/>
         </w:rPr>
-        <w:t xml:space="preserve">World Development Indicators</w:t>
-      </w:r>
-      <w:r>
-        <w:t xml:space="preserve">) mediante el paquete de R</w:t>
-      </w:r>
-      <w:r>
-        <w:t xml:space="preserve"> </w:t>
+        <w:t>World Development Indicators</w:t>
+      </w:r>
+      <w:r>
+        <w:rPr/>
+        <w:t xml:space="preserve">) mediante el paquete de R </w:t>
       </w:r>
       <w:r>
         <w:rPr>
           <w:rStyle w:val="VerbatimChar"/>
         </w:rPr>
-        <w:t xml:space="preserve">WDI</w:t>
-      </w:r>
-      <w:r>
-        <w:t xml:space="preserve"> </w:t>
-      </w:r>
-      <w:r>
-        <w:t xml:space="preserve">(Arel-Bundock, 2026)</w:t>
-      </w:r>
-      <w:r>
-        <w:t xml:space="preserve">. En segundo lugar, se utilizó la base de datos de pingüinos incluida en el paquete</w:t>
-      </w:r>
-      <w:r>
-        <w:t xml:space="preserve"> </w:t>
+        <w:t>WDI</w:t>
+      </w:r>
+      <w:r>
+        <w:rPr/>
+        <w:t xml:space="preserve"> (Arel-Bundock, 2026). En segundo lugar, se utilizó la base de datos de pingüinos incluida en el paquete </w:t>
       </w:r>
       <w:r>
         <w:rPr>
           <w:rStyle w:val="VerbatimChar"/>
         </w:rPr>
-        <w:t xml:space="preserve">palmerpenguins</w:t>
-      </w:r>
-      <w:r>
-        <w:t xml:space="preserve"> </w:t>
-      </w:r>
-      <w:r>
-        <w:t xml:space="preserve">(Horst et al., 2020)</w:t>
-      </w:r>
-      <w:r>
-        <w:t xml:space="preserve"> </w:t>
-      </w:r>
-      <w:r>
-        <w:t xml:space="preserve">como un ejemplo didáctico de análisis exploratorio multivariado. Finalmente, se incorporó información geoespacial administrativa de Panamá a nivel de primera división para ilustrar la generación de mapas dentro del mismo flujo de trabajo reproducible.</w:t>
-      </w:r>
+        <w:t>palmerpenguins</w:t>
+      </w:r>
+      <w:r>
+        <w:rPr/>
+        <w:t xml:space="preserve"> (Horst et al., 2020) como un ejemplo didáctico de análisis exploratorio multivariado. Finalmente, se incorporó información geoespacial administrativa de Panamá a nivel de primera división para ilustrar la generación de mapas dentro del mismo flujo de trabajo reproducible.</w:t>
+      </w:r>
+      <w:bookmarkEnd w:id="3"/>
     </w:p>
-    <w:bookmarkEnd w:id="14"/>
-    <w:bookmarkStart w:id="15" w:name="resultados"/>
     <w:p>
       <w:pPr>
         <w:pStyle w:val="Heading1"/>
+        <w:rPr/>
       </w:pPr>
-      <w:r>
-        <w:t xml:space="preserve">3. Resultados</w:t>
-      </w:r>
+      <w:bookmarkStart w:id="4" w:name="__RefHeading___Toc165_3134648260"/>
+      <w:bookmarkStart w:id="5" w:name="resultados"/>
+      <w:bookmarkEnd w:id="4"/>
+      <w:r>
+        <w:rPr/>
+        <w:t>3. Resultados</w:t>
+      </w:r>
+      <w:bookmarkEnd w:id="5"/>
     </w:p>
-    <w:bookmarkEnd w:id="15"/>
-    <w:bookmarkStart w:id="30" w:name="desempeño-económico"/>
     <w:p>
       <w:pPr>
         <w:pStyle w:val="Heading1"/>
+        <w:rPr/>
       </w:pPr>
-      <w:r>
-        <w:t xml:space="preserve">4. Desempeño económico</w:t>
+      <w:bookmarkStart w:id="6" w:name="__RefHeading___Toc167_3134648260"/>
+      <w:bookmarkEnd w:id="6"/>
+      <w:r>
+        <w:rPr/>
+        <w:t>4. Desempeño económico</w:t>
       </w:r>
     </w:p>
     <w:p>
       <w:pPr>
         <w:pStyle w:val="FirstParagraph"/>
+        <w:rPr/>
       </w:pPr>
       <w:r>
-        <w:t xml:space="preserve">El primer resultado que se presenta corresponde a la evolución reciente del Producto Interno Bruto de Panamá proveniente de la base de datos de indicadores globales del Banco Mundial</w:t>
-      </w:r>
-      <w:r>
-        <w:t xml:space="preserve"> </w:t>
-      </w:r>
-      <w:r>
-        <w:t xml:space="preserve">(Arel-Bundock, 2026)</w:t>
-      </w:r>
-      <w:r>
-        <w:t xml:space="preserve">. Como se observa en la</w:t>
-      </w:r>
-      <w:r>
-        <w:t xml:space="preserve"> </w:t>
+        <w:rPr/>
+        <w:t xml:space="preserve">El primer resultado que se presenta corresponde a la evolución reciente del Producto Interno Bruto de Panamá proveniente de la base de datos de indicadores globales del Banco Mundial (Arel-Bundock, 2026). Como se observa en la </w:t>
       </w:r>
       <w:hyperlink w:anchor="fig-pib">
         <w:r>
           <w:rPr>
             <w:rStyle w:val="Hyperlink"/>
           </w:rPr>
-          <w:t xml:space="preserve">Figura 1</w:t>
+          <w:t>Figura 1</w:t>
         </w:r>
       </w:hyperlink>
       <w:r>
-        <w:t xml:space="preserve">, el PIB muestra la caída abrupta característica del año 2020 asociada a la pandemia, seguida de una recuperación sostenida en los años posteriores.</w:t>
+        <w:rPr/>
+        <w:t>, el PIB muestra la caída abrupta característica del año 2020 asociada a la pandemia, seguida de una recuperación sostenida en los años posteriores.</w:t>
       </w:r>
     </w:p>
     <w:tbl>
       <w:tblPr>
         <w:tblStyle w:val="Table"/>
-        <w:tblW w:type="pct" w:w="5000"/>
+        <w:tblW w:w="5000" w:type="pct"/>
+        <w:jc w:val="start"/>
+        <w:tblInd w:w="0" w:type="dxa"/>
         <w:tblLayout w:type="fixed"/>
-        <w:tblLook w:firstRow="0" w:lastRow="0" w:firstColumn="0" w:lastColumn="0" w:noHBand="0" w:noVBand="0" w:val="0000"/>
+        <w:tblCellMar>
+          <w:top w:w="0" w:type="dxa"/>
+          <w:start w:w="108" w:type="dxa"/>
+          <w:bottom w:w="0" w:type="dxa"/>
+          <w:end w:w="108" w:type="dxa"/>
+        </w:tblCellMar>
+        <w:tblLook w:noHBand="0" w:noVBand="0" w:firstColumn="0" w:lastRow="0" w:lastColumn="0" w:firstRow="0" w:val="0000"/>
       </w:tblPr>
       <w:tblGrid>
-        <w:gridCol w:w="7920"/>
+        <w:gridCol w:w="9360"/>
       </w:tblGrid>
       <w:tr>
+        <w:trPr/>
         <w:tc>
-          <w:tcPr/>
-          <w:bookmarkStart w:id="19" w:name="fig-pib"/>
+          <w:tcPr>
+            <w:tcW w:w="9360" w:type="dxa"/>
+            <w:tcBorders/>
+          </w:tcPr>
           <w:p>
             <w:pPr>
               <w:pStyle w:val="Compact"/>
+              <w:suppressAutoHyphens w:val="true"/>
+              <w:spacing w:before="36" w:after="36"/>
               <w:jc w:val="center"/>
+              <w:rPr/>
             </w:pPr>
+            <w:bookmarkStart w:id="7" w:name="fig-pib"/>
             <w:r>
+              <w:rPr/>
               <w:drawing>
-                <wp:inline>
-                  <wp:extent cx="4620126" cy="3696101"/>
-                  <wp:effectExtent b="0" l="0" r="0" t="0"/>
-                  <wp:docPr descr="" title="" id="17" name="Picture"/>
-                  <a:graphic>
+                <wp:inline distT="0" distB="0" distL="0" distR="0">
+                  <wp:extent cx="4620260" cy="3696335"/>
+                  <wp:effectExtent l="0" t="0" r="0" b="0"/>
+                  <wp:docPr id="1" name="Picture"/>
+                  <wp:cNvGraphicFramePr>
+                    <a:graphicFrameLocks xmlns:a="http://schemas.openxmlformats.org/drawingml/2006/main" noChangeAspect="1"/>
+                  </wp:cNvGraphicFramePr>
+                  <a:graphic xmlns:a="http://schemas.openxmlformats.org/drawingml/2006/main">
                     <a:graphicData uri="http://schemas.openxmlformats.org/drawingml/2006/picture">
-                      <pic:pic>
+                      <pic:pic xmlns:pic="http://schemas.openxmlformats.org/drawingml/2006/picture">
                         <pic:nvPicPr>
-                          <pic:cNvPr descr="reporte_files/figure-docx/fig-pib-1.png" id="18" name="Picture"/>
+                          <pic:cNvPr id="1" name="Picture"/>
                           <pic:cNvPicPr>
-                            <a:picLocks noChangeArrowheads="1" noChangeAspect="1"/>
+                            <a:picLocks noChangeAspect="1" noChangeArrowheads="1"/>
                           </pic:cNvPicPr>
                         </pic:nvPicPr>
                         <pic:blipFill>
-                          <a:blip r:embed="rId16"/>
+                          <a:blip r:embed="rId2"/>
                           <a:stretch>
                             <a:fillRect/>
                           </a:stretch>
@@ -222,17 +422,12 @@
                         <pic:spPr bwMode="auto">
                           <a:xfrm>
                             <a:off x="0" y="0"/>
-                            <a:ext cx="4620126" cy="3696101"/>
+                            <a:ext cx="4620260" cy="3696335"/>
                           </a:xfrm>
                           <a:prstGeom prst="rect">
                             <a:avLst/>
                           </a:prstGeom>
                           <a:noFill/>
-                          <a:ln w="9525">
-                            <a:noFill/>
-                            <a:headEnd/>
-                            <a:tailEnd/>
-                          </a:ln>
                         </pic:spPr>
                       </pic:pic>
                     </a:graphicData>
@@ -243,100 +438,110 @@
           </w:p>
           <w:p>
             <w:pPr>
-              <w:jc w:val="center"/>
-            </w:pPr>
-            <w:pPr>
-              <w:jc w:val="left"/>
-              <w:spacing w:before="200"/>
               <w:pStyle w:val="ImageCaption"/>
+              <w:suppressAutoHyphens w:val="true"/>
+              <w:spacing w:before="200" w:after="120"/>
+              <w:jc w:val="start"/>
+              <w:rPr/>
             </w:pPr>
             <w:r>
-              <w:t xml:space="preserve">Figura 1: Producto Interno Bruto de Panamá, 2020-2025</w:t>
+              <w:rPr/>
+              <w:t>Figura 1: Producto Interno Bruto de Panamá, 2020-2025</w:t>
             </w:r>
+            <w:bookmarkEnd w:id="7"/>
           </w:p>
-          <w:bookmarkEnd w:id="19"/>
         </w:tc>
       </w:tr>
     </w:tbl>
-    <w:bookmarkStart w:id="24" w:name="una-mirada-a-la-naturaleza"/>
     <w:p>
       <w:pPr>
         <w:pStyle w:val="Heading2"/>
+        <w:rPr/>
       </w:pPr>
-      <w:r>
-        <w:t xml:space="preserve">4.1 Una mirada a la naturaleza</w:t>
+      <w:bookmarkStart w:id="8" w:name="__RefHeading___Toc169_3134648260"/>
+      <w:bookmarkEnd w:id="8"/>
+      <w:r>
+        <w:rPr/>
+        <w:t>4.1 Una mirada a la naturaleza</w:t>
       </w:r>
     </w:p>
     <w:p>
       <w:pPr>
         <w:pStyle w:val="FirstParagraph"/>
+        <w:rPr/>
       </w:pPr>
       <w:r>
-        <w:t xml:space="preserve">Como segundo ejercicio ilustrativo, se exploró la relación entre el largo y el grosor del pico en la base de datos de pingüinos</w:t>
-      </w:r>
-      <w:r>
-        <w:t xml:space="preserve"> </w:t>
-      </w:r>
-      <w:r>
-        <w:t xml:space="preserve">(Horst et al., 2020)</w:t>
-      </w:r>
-      <w:r>
-        <w:t xml:space="preserve">, diferenciando por especie. La</w:t>
-      </w:r>
-      <w:r>
-        <w:t xml:space="preserve"> </w:t>
+        <w:rPr/>
+        <w:t xml:space="preserve">Como segundo ejercicio ilustrativo, se exploró la relación entre el largo y el grosor del pico en la base de datos de pingüinos (Horst et al., 2020), diferenciando por especie. La </w:t>
       </w:r>
       <w:hyperlink w:anchor="fig-pinguinos">
         <w:r>
           <w:rPr>
             <w:rStyle w:val="Hyperlink"/>
           </w:rPr>
-          <w:t xml:space="preserve">Figura 2</w:t>
+          <w:t>Figura 2</w:t>
         </w:r>
       </w:hyperlink>
       <w:r>
-        <w:t xml:space="preserve"> </w:t>
-      </w:r>
-      <w:r>
-        <w:t xml:space="preserve">muestra una agrupación relativamente clara de las tres especies en este espacio bivariado, lo cual es consistente con el uso frecuente de este conjunto de datos como ejemplo pedagógico de clasificación.</w:t>
+        <w:rPr/>
+        <w:t xml:space="preserve"> muestra una agrupación relativamente clara de las tres especies en este espacio bivariado, lo cual es consistente con el uso frecuente de este conjunto de datos como ejemplo pedagógico de clasificación.</w:t>
       </w:r>
     </w:p>
     <w:tbl>
       <w:tblPr>
         <w:tblStyle w:val="Table"/>
-        <w:tblW w:type="pct" w:w="5000"/>
+        <w:tblW w:w="5000" w:type="pct"/>
+        <w:jc w:val="start"/>
+        <w:tblInd w:w="0" w:type="dxa"/>
         <w:tblLayout w:type="fixed"/>
-        <w:tblLook w:firstRow="0" w:lastRow="0" w:firstColumn="0" w:lastColumn="0" w:noHBand="0" w:noVBand="0" w:val="0000"/>
+        <w:tblCellMar>
+          <w:top w:w="0" w:type="dxa"/>
+          <w:start w:w="108" w:type="dxa"/>
+          <w:bottom w:w="0" w:type="dxa"/>
+          <w:end w:w="108" w:type="dxa"/>
+        </w:tblCellMar>
+        <w:tblLook w:noHBand="0" w:noVBand="0" w:firstColumn="0" w:lastRow="0" w:lastColumn="0" w:firstRow="0" w:val="0000"/>
       </w:tblPr>
       <w:tblGrid>
-        <w:gridCol w:w="7920"/>
+        <w:gridCol w:w="9360"/>
       </w:tblGrid>
       <w:tr>
+        <w:trPr/>
         <w:tc>
-          <w:tcPr/>
-          <w:bookmarkStart w:id="23" w:name="fig-pinguinos"/>
+          <w:tcPr>
+            <w:tcW w:w="9360" w:type="dxa"/>
+            <w:tcBorders/>
+          </w:tcPr>
           <w:p>
             <w:pPr>
               <w:pStyle w:val="Compact"/>
+              <w:suppressAutoHyphens w:val="true"/>
+              <w:spacing w:before="36" w:after="36"/>
               <w:jc w:val="center"/>
+              <w:rPr/>
             </w:pPr>
+            <w:bookmarkStart w:id="9" w:name="fig-pinguinos"/>
             <w:r>
+              <w:rPr/>
               <w:drawing>
-                <wp:inline>
-                  <wp:extent cx="4620126" cy="3696101"/>
-                  <wp:effectExtent b="0" l="0" r="0" t="0"/>
-                  <wp:docPr descr="" title="" id="21" name="Picture"/>
-                  <a:graphic>
+                <wp:inline distT="0" distB="0" distL="0" distR="0">
+                  <wp:extent cx="4620260" cy="3696335"/>
+                  <wp:effectExtent l="0" t="0" r="0" b="0"/>
+                  <wp:docPr id="2" name="Image2"/>
+                  <wp:cNvGraphicFramePr>
+                    <a:graphicFrameLocks xmlns:a="http://schemas.openxmlformats.org/drawingml/2006/main" noChangeAspect="1"/>
+                  </wp:cNvGraphicFramePr>
+                  <a:graphic xmlns:a="http://schemas.openxmlformats.org/drawingml/2006/main">
                     <a:graphicData uri="http://schemas.openxmlformats.org/drawingml/2006/picture">
-                      <pic:pic>
+                      <pic:pic xmlns:pic="http://schemas.openxmlformats.org/drawingml/2006/picture">
                         <pic:nvPicPr>
-                          <pic:cNvPr descr="reporte_files/figure-docx/fig-pinguinos-1.png" id="22" name="Picture"/>
+                          <pic:cNvPr id="2" name="Image2"/>
                           <pic:cNvPicPr>
-                            <a:picLocks noChangeArrowheads="1" noChangeAspect="1"/>
+                            <a:picLocks noChangeAspect="1" noChangeArrowheads="1"/>
                           </pic:cNvPicPr>
                         </pic:nvPicPr>
                         <pic:blipFill>
-                          <a:blip r:embed="rId20"/>
+                          <a:blip r:embed="rId3"/>
                           <a:stretch>
                             <a:fillRect/>
                           </a:stretch>
@@ -344,17 +549,12 @@
                         <pic:spPr bwMode="auto">
                           <a:xfrm>
                             <a:off x="0" y="0"/>
-                            <a:ext cx="4620126" cy="3696101"/>
+                            <a:ext cx="4620260" cy="3696335"/>
                           </a:xfrm>
                           <a:prstGeom prst="rect">
                             <a:avLst/>
                           </a:prstGeom>
                           <a:noFill/>
-                          <a:ln w="9525">
-                            <a:noFill/>
-                            <a:headEnd/>
-                            <a:tailEnd/>
-                          </a:ln>
                         </pic:spPr>
                       </pic:pic>
                     </a:graphicData>
@@ -365,92 +565,110 @@
           </w:p>
           <w:p>
             <w:pPr>
-              <w:jc w:val="center"/>
-            </w:pPr>
-            <w:pPr>
-              <w:jc w:val="left"/>
-              <w:spacing w:before="200"/>
               <w:pStyle w:val="ImageCaption"/>
+              <w:suppressAutoHyphens w:val="true"/>
+              <w:spacing w:before="200" w:after="120"/>
+              <w:jc w:val="start"/>
+              <w:rPr/>
             </w:pPr>
             <w:r>
-              <w:t xml:space="preserve">Figura 2: Largo y grosor del pico de pingüinos, por especie</w:t>
+              <w:rPr/>
+              <w:t>Figura 2: Largo y grosor del pico de pingüinos, por especie</w:t>
             </w:r>
+            <w:bookmarkEnd w:id="9"/>
           </w:p>
-          <w:bookmarkEnd w:id="23"/>
         </w:tc>
       </w:tr>
     </w:tbl>
-    <w:bookmarkEnd w:id="24"/>
-    <w:bookmarkStart w:id="29" w:name="la-perspectiva-geográfica"/>
     <w:p>
       <w:pPr>
         <w:pStyle w:val="Heading2"/>
+        <w:rPr/>
       </w:pPr>
-      <w:r>
-        <w:t xml:space="preserve">4.2 La perspectiva geográfica</w:t>
+      <w:bookmarkStart w:id="10" w:name="__RefHeading___Toc171_3134648260"/>
+      <w:bookmarkEnd w:id="10"/>
+      <w:r>
+        <w:rPr/>
+        <w:t>4.2 La perspectiva geográfica</w:t>
       </w:r>
     </w:p>
     <w:p>
       <w:pPr>
         <w:pStyle w:val="FirstParagraph"/>
+        <w:rPr/>
       </w:pPr>
       <w:r>
-        <w:t xml:space="preserve">Por último, la</w:t>
-      </w:r>
-      <w:r>
-        <w:t xml:space="preserve"> </w:t>
+        <w:rPr/>
+        <w:t xml:space="preserve">Por último, la </w:t>
       </w:r>
       <w:hyperlink w:anchor="fig-mapa">
         <w:r>
           <w:rPr>
             <w:rStyle w:val="Hyperlink"/>
           </w:rPr>
-          <w:t xml:space="preserve">Figura 3</w:t>
+          <w:t>Figura 3</w:t>
         </w:r>
       </w:hyperlink>
       <w:r>
-        <w:t xml:space="preserve"> </w:t>
-      </w:r>
-      <w:r>
-        <w:t xml:space="preserve">presenta la división administrativa de primer nivel de Panamá, generada a partir de datos geoespaciales, la cual serviría como base cartográfica para futuros análisis territoriales.</w:t>
+        <w:rPr/>
+        <w:t xml:space="preserve"> presenta la división administrativa de primer nivel de Panamá, generada a partir de datos geoespaciales, la cual serviría como base cartográfica para futuros análisis territoriales.</w:t>
       </w:r>
     </w:p>
     <w:tbl>
       <w:tblPr>
         <w:tblStyle w:val="Table"/>
-        <w:tblW w:type="pct" w:w="5000"/>
+        <w:tblW w:w="5000" w:type="pct"/>
+        <w:jc w:val="start"/>
+        <w:tblInd w:w="0" w:type="dxa"/>
         <w:tblLayout w:type="fixed"/>
-        <w:tblLook w:firstRow="0" w:lastRow="0" w:firstColumn="0" w:lastColumn="0" w:noHBand="0" w:noVBand="0" w:val="0000"/>
+        <w:tblCellMar>
+          <w:top w:w="0" w:type="dxa"/>
+          <w:start w:w="108" w:type="dxa"/>
+          <w:bottom w:w="0" w:type="dxa"/>
+          <w:end w:w="108" w:type="dxa"/>
+        </w:tblCellMar>
+        <w:tblLook w:noHBand="0" w:noVBand="0" w:firstColumn="0" w:lastRow="0" w:lastColumn="0" w:firstRow="0" w:val="0000"/>
       </w:tblPr>
       <w:tblGrid>
-        <w:gridCol w:w="7920"/>
+        <w:gridCol w:w="9360"/>
       </w:tblGrid>
       <w:tr>
+        <w:trPr/>
         <w:tc>
-          <w:tcPr/>
-          <w:bookmarkStart w:id="28" w:name="fig-mapa"/>
+          <w:tcPr>
+            <w:tcW w:w="9360" w:type="dxa"/>
+            <w:tcBorders/>
+          </w:tcPr>
           <w:p>
             <w:pPr>
               <w:pStyle w:val="Compact"/>
+              <w:suppressAutoHyphens w:val="true"/>
+              <w:spacing w:before="36" w:after="36"/>
               <w:jc w:val="center"/>
+              <w:rPr/>
             </w:pPr>
+            <w:bookmarkStart w:id="11" w:name="fig-mapa"/>
             <w:r>
+              <w:rPr/>
               <w:drawing>
-                <wp:inline>
-                  <wp:extent cx="4620126" cy="3696101"/>
-                  <wp:effectExtent b="0" l="0" r="0" t="0"/>
-                  <wp:docPr descr="" title="" id="26" name="Picture"/>
-                  <a:graphic>
+                <wp:inline distT="0" distB="0" distL="0" distR="0">
+                  <wp:extent cx="4620260" cy="3696335"/>
+                  <wp:effectExtent l="0" t="0" r="0" b="0"/>
+                  <wp:docPr id="3" name="Image3"/>
+                  <wp:cNvGraphicFramePr>
+                    <a:graphicFrameLocks xmlns:a="http://schemas.openxmlformats.org/drawingml/2006/main" noChangeAspect="1"/>
+                  </wp:cNvGraphicFramePr>
+                  <a:graphic xmlns:a="http://schemas.openxmlformats.org/drawingml/2006/main">
                     <a:graphicData uri="http://schemas.openxmlformats.org/drawingml/2006/picture">
-                      <pic:pic>
+                      <pic:pic xmlns:pic="http://schemas.openxmlformats.org/drawingml/2006/picture">
                         <pic:nvPicPr>
-                          <pic:cNvPr descr="reporte_files/figure-docx/fig-mapa-1.png" id="27" name="Picture"/>
+                          <pic:cNvPr id="3" name="Image3"/>
                           <pic:cNvPicPr>
-                            <a:picLocks noChangeArrowheads="1" noChangeAspect="1"/>
+                            <a:picLocks noChangeAspect="1" noChangeArrowheads="1"/>
                           </pic:cNvPicPr>
                         </pic:nvPicPr>
                         <pic:blipFill>
-                          <a:blip r:embed="rId25"/>
+                          <a:blip r:embed="rId4"/>
                           <a:stretch>
                             <a:fillRect/>
                           </a:stretch>
@@ -458,17 +676,12 @@
                         <pic:spPr bwMode="auto">
                           <a:xfrm>
                             <a:off x="0" y="0"/>
-                            <a:ext cx="4620126" cy="3696101"/>
+                            <a:ext cx="4620260" cy="3696335"/>
                           </a:xfrm>
                           <a:prstGeom prst="rect">
                             <a:avLst/>
                           </a:prstGeom>
                           <a:noFill/>
-                          <a:ln w="9525">
-                            <a:noFill/>
-                            <a:headEnd/>
-                            <a:tailEnd/>
-                          </a:ln>
                         </pic:spPr>
                       </pic:pic>
                     </a:graphicData>
@@ -479,186 +692,170 @@
           </w:p>
           <w:p>
             <w:pPr>
-              <w:jc w:val="center"/>
-            </w:pPr>
-            <w:pPr>
-              <w:jc w:val="left"/>
-              <w:spacing w:before="200"/>
               <w:pStyle w:val="ImageCaption"/>
+              <w:suppressAutoHyphens w:val="true"/>
+              <w:spacing w:before="200" w:after="120"/>
+              <w:jc w:val="start"/>
+              <w:rPr/>
             </w:pPr>
             <w:r>
-              <w:t xml:space="preserve">Figura 3: División administrativa de primer nivel de Panamá</w:t>
+              <w:rPr/>
+              <w:t>Figura 3: División administrativa de primer nivel de Panamá</w:t>
             </w:r>
+            <w:bookmarkStart w:id="12" w:name="desempeño-económico"/>
+            <w:bookmarkEnd w:id="11"/>
+            <w:bookmarkEnd w:id="12"/>
           </w:p>
-          <w:bookmarkEnd w:id="28"/>
         </w:tc>
       </w:tr>
     </w:tbl>
-    <w:bookmarkEnd w:id="29"/>
-    <w:bookmarkEnd w:id="30"/>
-    <w:bookmarkStart w:id="37" w:name="conclusiones"/>
     <w:p>
       <w:pPr>
         <w:pStyle w:val="Heading1"/>
+        <w:rPr/>
       </w:pPr>
-      <w:r>
-        <w:t xml:space="preserve">5. Conclusiones</w:t>
+      <w:bookmarkStart w:id="13" w:name="__RefHeading___Toc173_3134648260"/>
+      <w:bookmarkEnd w:id="13"/>
+      <w:r>
+        <w:rPr/>
+        <w:t>5. Conclusiones</w:t>
       </w:r>
     </w:p>
     <w:p>
       <w:pPr>
         <w:pStyle w:val="FirstParagraph"/>
+        <w:rPr/>
       </w:pPr>
       <w:r>
-        <w:t xml:space="preserve">Este reporte ficticio ilustra, con fines exclusivamente demostrativos, cómo integrar fuentes de datos heterogéneas (indicadores macroeconómicos obtenidos mediante</w:t>
-      </w:r>
-      <w:r>
-        <w:t xml:space="preserve"> </w:t>
+        <w:rPr/>
+        <w:t xml:space="preserve">Este reporte ficticio ilustra, con fines exclusivamente demostrativos, cómo integrar fuentes de datos heterogéneas (indicadores macroeconómicos obtenidos mediante </w:t>
       </w:r>
       <w:r>
         <w:rPr>
           <w:rStyle w:val="VerbatimChar"/>
         </w:rPr>
-        <w:t xml:space="preserve">WDI</w:t>
-      </w:r>
-      <w:r>
-        <w:t xml:space="preserve"> </w:t>
-      </w:r>
-      <w:r>
-        <w:t xml:space="preserve">(Arel-Bundock, 2026)</w:t>
-      </w:r>
-      <w:r>
-        <w:t xml:space="preserve">, datos biológicos de ejemplo del paquete</w:t>
-      </w:r>
-      <w:r>
-        <w:t xml:space="preserve"> </w:t>
+        <w:t>WDI</w:t>
+      </w:r>
+      <w:r>
+        <w:rPr/>
+        <w:t xml:space="preserve"> (Arel-Bundock, 2026), datos biológicos de ejemplo del paquete </w:t>
       </w:r>
       <w:r>
         <w:rPr>
           <w:rStyle w:val="VerbatimChar"/>
         </w:rPr>
-        <w:t xml:space="preserve">palmerpenguins</w:t>
-      </w:r>
-      <w:r>
-        <w:t xml:space="preserve"> </w:t>
-      </w:r>
-      <w:r>
-        <w:t xml:space="preserve">(Horst et al., 2020)</w:t>
-      </w:r>
-      <w:r>
-        <w:t xml:space="preserve"> </w:t>
-      </w:r>
-      <w:r>
-        <w:t xml:space="preserve">y capas geoespaciales) en un único documento reproducible con referencias cruzadas a figuras y citas bibliográficas.</w:t>
+        <w:t>palmerpenguins</w:t>
+      </w:r>
+      <w:r>
+        <w:rPr/>
+        <w:t xml:space="preserve"> (Horst et al., 2020) y capas geoespaciales) en un único documento reproducible con referencias cruzadas a figuras y citas bibliográficas.</w:t>
       </w:r>
     </w:p>
     <w:p>
       <w:pPr>
         <w:pStyle w:val="BodyText"/>
+        <w:rPr/>
       </w:pPr>
       <w:r>
-        <w:t xml:space="preserve">Para futuros ejercicios de este tipo se recomienda ampliar el rango temporal de las series económicas y contrastar el desempeño de Panamá con el de otros países de la región centroamericana. También sería conveniente incorporar variables geoespaciales adicionales, como indicadores socioeconómicos a nivel provincial, para enriquecer el análisis territorial. Finalmente, se recomienda documentar de manera explícita las limitaciones de cada fuente de datos utilizada, de forma que quede clara la naturaleza ilustrativa de este tipo de reportes.</w:t>
+        <w:rPr/>
+        <w:t>Para futuros ejercicios de este tipo se recomienda ampliar el rango temporal de las series económicas y contrastar el desempeño de Panamá con el de otros países de la región centroamericana. También sería conveniente incorporar variables geoespaciales adicionales, como indicadores socioeconómicos a nivel provincial, para enriquecer el análisis territorial. Finalmente, se recomienda documentar de manera explícita las limitaciones de cada fuente de datos utilizada, de forma que quede clara la naturaleza ilustrativa de este tipo de reportes.</w:t>
       </w:r>
     </w:p>
-    <w:bookmarkStart w:id="36" w:name="referencias"/>
     <w:p>
       <w:pPr>
         <w:pStyle w:val="Heading2"/>
+        <w:rPr/>
       </w:pPr>
-      <w:r>
-        <w:t xml:space="preserve">Referencias</w:t>
+      <w:bookmarkStart w:id="14" w:name="__RefHeading___Toc175_3134648260"/>
+      <w:bookmarkStart w:id="15" w:name="referencias"/>
+      <w:bookmarkEnd w:id="14"/>
+      <w:r>
+        <w:rPr/>
+        <w:t>Referencias</w:t>
       </w:r>
     </w:p>
-    <w:bookmarkStart w:id="35" w:name="refs"/>
-    <w:bookmarkStart w:id="32" w:name="ref-arelbundock_wdi_2026"/>
     <w:p>
       <w:pPr>
         <w:pStyle w:val="Bibliography"/>
+        <w:rPr/>
       </w:pPr>
-      <w:r>
-        <w:t xml:space="preserve">Arel-Bundock, V. (2026).</w:t>
-      </w:r>
-      <w:r>
-        <w:t xml:space="preserve"> </w:t>
+      <w:bookmarkStart w:id="16" w:name="refs"/>
+      <w:bookmarkStart w:id="17" w:name="ref-arelbundock_wdi_2026"/>
+      <w:r>
+        <w:rPr/>
+        <w:t xml:space="preserve">Arel-Bundock, V. (2026). </w:t>
       </w:r>
       <w:r>
         <w:rPr>
           <w:i/>
           <w:iCs/>
         </w:rPr>
-        <w:t xml:space="preserve">WDI: World Development Indicators and Other World Bank Data</w:t>
-      </w:r>
-      <w:r>
-        <w:t xml:space="preserve">.</w:t>
-      </w:r>
-      <w:r>
-        <w:t xml:space="preserve"> </w:t>
-      </w:r>
-      <w:hyperlink r:id="rId31">
+        <w:t>WDI: World Development Indicators and Other World Bank Data</w:t>
+      </w:r>
+      <w:r>
+        <w:rPr/>
+        <w:t xml:space="preserve">. </w:t>
+      </w:r>
+      <w:hyperlink r:id="rId5">
         <w:r>
           <w:rPr>
             <w:rStyle w:val="Hyperlink"/>
           </w:rPr>
-          <w:t xml:space="preserve">https://doi.org/10.32614/CRAN.package.WDI</w:t>
+          <w:t>https://doi.org/10.32614/CRAN.package.WDI</w:t>
         </w:r>
       </w:hyperlink>
+      <w:bookmarkEnd w:id="17"/>
     </w:p>
-    <w:bookmarkEnd w:id="32"/>
-    <w:bookmarkStart w:id="34" w:name="ref-horst_palmerpenguins_2020"/>
     <w:p>
       <w:pPr>
         <w:pStyle w:val="Bibliography"/>
+        <w:spacing w:before="0" w:after="200"/>
+        <w:ind w:hanging="720" w:start="720"/>
+        <w:jc w:val="both"/>
+        <w:rPr/>
       </w:pPr>
-      <w:r>
-        <w:t xml:space="preserve">Horst, A. M., Hill, A. P. y Gorman, K. B. (2020).</w:t>
-      </w:r>
-      <w:r>
-        <w:t xml:space="preserve"> </w:t>
+      <w:bookmarkStart w:id="18" w:name="ref-horst_palmerpenguins_2020"/>
+      <w:r>
+        <w:rPr/>
+        <w:t xml:space="preserve">Horst, A. M., Hill, A. P. y Gorman, K. B. (2020). </w:t>
       </w:r>
       <w:r>
         <w:rPr>
           <w:i/>
           <w:iCs/>
         </w:rPr>
-        <w:t xml:space="preserve">palmerpenguins: Palmer Archipelago (Antarctica) penguin data</w:t>
-      </w:r>
-      <w:r>
-        <w:t xml:space="preserve">.</w:t>
-      </w:r>
-      <w:r>
-        <w:t xml:space="preserve"> </w:t>
-      </w:r>
-      <w:hyperlink r:id="rId33">
+        <w:t>palmerpenguins: Palmer Archipelago (Antarctica) penguin data</w:t>
+      </w:r>
+      <w:r>
+        <w:rPr/>
+        <w:t xml:space="preserve">. </w:t>
+      </w:r>
+      <w:hyperlink r:id="rId6">
         <w:r>
           <w:rPr>
             <w:rStyle w:val="Hyperlink"/>
           </w:rPr>
-          <w:t xml:space="preserve">https://doi.org/10.5281/zenodo.3960218</w:t>
+          <w:t>https://doi.org/10.5281/zenodo.3960218</w:t>
         </w:r>
       </w:hyperlink>
+      <w:bookmarkEnd w:id="15"/>
+      <w:bookmarkEnd w:id="16"/>
+      <w:bookmarkEnd w:id="18"/>
     </w:p>
-    <w:bookmarkEnd w:id="34"/>
-    <w:bookmarkEnd w:id="35"/>
-    <w:bookmarkEnd w:id="36"/>
-    <w:bookmarkEnd w:id="37"/>
     <w:sectPr>
-      <w:footerReference r:id="rId2" w:type="even"/>
-      <w:footerReference r:id="rId3" w:type="default"/>
-      <w:footerReference r:id="rId4" w:type="first"/>
+      <w:footerReference w:type="even" r:id="rId7"/>
+      <w:footerReference w:type="default" r:id="rId8"/>
+      <w:footerReference w:type="first" r:id="rId9"/>
       <w:type w:val="nextPage"/>
-      <w:pgSz w:h="15840" w:w="12240"/>
-      <w:pgMar w:bottom="1440" w:footer="720" w:gutter="0" w:header="0" w:left="1440" w:right="1440" w:top="1440"/>
+      <w:pgSz w:w="12240" w:h="15840"/>
+      <w:pgMar w:left="1440" w:right="1440" w:gutter="0" w:header="0" w:top="1440" w:footer="720" w:bottom="1440"/>
       <w:pgNumType w:fmt="decimal"/>
       <w:formProt w:val="false"/>
       <w:textDirection w:val="lrTb"/>
-      <w:docGrid w:charSpace="0" w:linePitch="100" w:type="default"/>
+      <w:docGrid w:type="default" w:linePitch="100" w:charSpace="0"/>
     </w:sectPr>
   </w:body>
 </w:document>
-</file>
-
-<file path=word/comments.xml><?xml version="1.0" encoding="utf-8"?>
-<w:comments xmlns:w="http://schemas.openxmlformats.org/wordprocessingml/2006/main" xmlns:m="http://schemas.openxmlformats.org/officeDocument/2006/math" xmlns:r="http://schemas.openxmlformats.org/officeDocument/2006/relationships" xmlns:o="urn:schemas-microsoft-com:office:office" xmlns:v="urn:schemas-microsoft-com:vml" xmlns:w10="urn:schemas-microsoft-com:office:word" xmlns:a="http://schemas.openxmlformats.org/drawingml/2006/main" xmlns:pic="http://schemas.openxmlformats.org/drawingml/2006/picture" xmlns:wp="http://schemas.openxmlformats.org/drawingml/2006/wordprocessingDrawing"/>
 </file>
 
 <file path=word/footer1.xml><?xml version="1.0" encoding="utf-8"?>
@@ -700,7 +897,7 @@
     </w:r>
     <w:r>
       <w:rPr/>
-      <w:t>1</w:t>
+      <w:t>5</w:t>
     </w:r>
     <w:r>
       <w:rPr/>
@@ -735,7 +932,7 @@
     </w:r>
     <w:r>
       <w:rPr/>
-      <w:t>1</w:t>
+      <w:t>5</w:t>
     </w:r>
     <w:r>
       <w:rPr/>
@@ -745,118 +942,15 @@
 </w:ftr>
 </file>
 
-<file path=word/footnotes.xml><?xml version="1.0" encoding="utf-8"?>
-<w:footnotes xmlns:w="http://schemas.openxmlformats.org/wordprocessingml/2006/main" xmlns:m="http://schemas.openxmlformats.org/officeDocument/2006/math" xmlns:r="http://schemas.openxmlformats.org/officeDocument/2006/relationships" xmlns:o="urn:schemas-microsoft-com:office:office" xmlns:v="urn:schemas-microsoft-com:vml" xmlns:w10="urn:schemas-microsoft-com:office:word" xmlns:a="http://schemas.openxmlformats.org/drawingml/2006/main" xmlns:pic="http://schemas.openxmlformats.org/drawingml/2006/picture" xmlns:wp="http://schemas.openxmlformats.org/drawingml/2006/wordprocessingDrawing">
-  <w:footnote w:type="continuationSeparator" w:id="0">
-    <w:p>
-      <w:r>
-        <w:continuationSeparator/>
-      </w:r>
-    </w:p>
-  </w:footnote>
-  <w:footnote w:type="separator" w:id="-1">
-    <w:p>
-      <w:r>
-        <w:separator/>
-      </w:r>
-    </w:p>
-  </w:footnote>
-</w:footnotes>
-</file>
-
-<file path=word/numbering.xml><?xml version="1.0" encoding="utf-8"?>
-<w:numbering xmlns:w="http://schemas.openxmlformats.org/wordprocessingml/2006/main">
-  <w:abstractNum w:abstractNumId="990">
-    <w:nsid w:val="0000A990"/>
-    <w:multiLevelType w:val="multilevel"/>
-    <w:lvl w:ilvl="0">
-      <w:numFmt w:val="bullet"/>
-      <w:lvlText w:val=" "/>
-      <w:lvlJc w:val="left"/>
-      <w:pPr>
-        <w:ind w:left="720" w:hanging="360"/>
-      </w:pPr>
-    </w:lvl>
-    <w:lvl w:ilvl="1">
-      <w:numFmt w:val="bullet"/>
-      <w:lvlText w:val=" "/>
-      <w:lvlJc w:val="left"/>
-      <w:pPr>
-        <w:ind w:left="1440" w:hanging="360"/>
-      </w:pPr>
-    </w:lvl>
-    <w:lvl w:ilvl="2">
-      <w:numFmt w:val="bullet"/>
-      <w:lvlText w:val=" "/>
-      <w:lvlJc w:val="left"/>
-      <w:pPr>
-        <w:ind w:left="2160" w:hanging="360"/>
-      </w:pPr>
-    </w:lvl>
-    <w:lvl w:ilvl="3">
-      <w:numFmt w:val="bullet"/>
-      <w:lvlText w:val=" "/>
-      <w:lvlJc w:val="left"/>
-      <w:pPr>
-        <w:ind w:left="2880" w:hanging="360"/>
-      </w:pPr>
-    </w:lvl>
-    <w:lvl w:ilvl="4">
-      <w:numFmt w:val="bullet"/>
-      <w:lvlText w:val=" "/>
-      <w:lvlJc w:val="left"/>
-      <w:pPr>
-        <w:ind w:left="3600" w:hanging="360"/>
-      </w:pPr>
-    </w:lvl>
-    <w:lvl w:ilvl="5">
-      <w:numFmt w:val="bullet"/>
-      <w:lvlText w:val=" "/>
-      <w:lvlJc w:val="left"/>
-      <w:pPr>
-        <w:ind w:left="4320" w:hanging="360"/>
-      </w:pPr>
-    </w:lvl>
-    <w:lvl w:ilvl="6">
-      <w:numFmt w:val="bullet"/>
-      <w:lvlText w:val=" "/>
-      <w:lvlJc w:val="left"/>
-      <w:pPr>
-        <w:ind w:left="5040" w:hanging="360"/>
-      </w:pPr>
-    </w:lvl>
-    <w:lvl w:ilvl="7">
-      <w:numFmt w:val="bullet"/>
-      <w:lvlText w:val=" "/>
-      <w:lvlJc w:val="left"/>
-      <w:pPr>
-        <w:ind w:left="5760" w:hanging="360"/>
-      </w:pPr>
-    </w:lvl>
-    <w:lvl w:ilvl="8">
-      <w:numFmt w:val="bullet"/>
-      <w:lvlText w:val=" "/>
-      <w:lvlJc w:val="left"/>
-      <w:pPr>
-        <w:ind w:left="6480" w:hanging="360"/>
-      </w:pPr>
-    </w:lvl>
-  </w:abstractNum>
-  <w:num w:numId="1000">
-    <w:abstractNumId w:val="990"/>
-  </w:num>
-</w:numbering>
-</file>
-
 <file path=word/styles.xml><?xml version="1.0" encoding="utf-8"?>
-<w:styles xmlns:mc="http://schemas.openxmlformats.org/markup-compatibility/2006" xmlns:w="http://schemas.openxmlformats.org/wordprocessingml/2006/main" xmlns:w14="http://schemas.microsoft.com/office/word/2010/wordml" mc:Ignorable="w14">
+<w:styles xmlns:w="http://schemas.openxmlformats.org/wordprocessingml/2006/main" xmlns:w14="http://schemas.microsoft.com/office/word/2010/wordml" xmlns:mc="http://schemas.openxmlformats.org/markup-compatibility/2006" mc:Ignorable="w14">
   <w:docDefaults>
     <w:rPrDefault>
       <w:rPr>
-        <w:rFonts w:ascii="Aptos" w:asciiTheme="minorHAnsi" w:cs="" w:cstheme="minorBidi" w:eastAsia="Aptos" w:eastAsiaTheme="minorHAnsi" w:hAnsi="Aptos" w:hAnsiTheme="minorHAnsi"/>
+        <w:rFonts w:ascii="Aptos" w:hAnsi="Aptos" w:eastAsia="Aptos" w:cs="" w:asciiTheme="minorHAnsi" w:cstheme="minorBidi" w:eastAsiaTheme="minorHAnsi" w:hAnsiTheme="minorHAnsi"/>
         <w:sz w:val="24"/>
         <w:szCs w:val="24"/>
-        <w:lang w:bidi="ar-SA" w:eastAsia="en-US" w:val="es"/>
+        <w:lang w:val="es-ES" w:eastAsia="en-US" w:bidi="ar-SA"/>
       </w:rPr>
     </w:rPrDefault>
     <w:pPrDefault>
@@ -865,7 +959,7 @@
       </w:pPr>
     </w:pPrDefault>
   </w:docDefaults>
-  <w:latentStyles w:count="376" w:defLockedState="0" w:defQFormat="0" w:defSemiHidden="0" w:defUIPriority="0" w:defUnhideWhenUsed="0">
+  <w:latentStyles w:defLockedState="0" w:defUIPriority="0" w:defSemiHidden="0" w:defUnhideWhenUsed="0" w:defQFormat="0" w:count="376">
     <w:lsdException w:name="toc 1" w:uiPriority="39"/>
     <w:lsdException w:name="toc 2" w:uiPriority="39"/>
     <w:lsdException w:name="toc 3" w:uiPriority="39"/>
@@ -1107,31 +1201,32 @@
     <w:lsdException w:name="List Table 5 Dark Accent 6" w:uiPriority="50"/>
     <w:lsdException w:name="List Table 6 Colorful Accent 6" w:uiPriority="51"/>
     <w:lsdException w:name="List Table 7 Colorful Accent 6" w:uiPriority="52"/>
-    <w:lsdException w:name="Mention" w:semiHidden="1" w:uiPriority="99" w:unhideWhenUsed="1"/>
-    <w:lsdException w:name="Smart Hyperlink" w:semiHidden="1" w:uiPriority="99" w:unhideWhenUsed="1"/>
-    <w:lsdException w:name="Hashtag" w:semiHidden="1" w:uiPriority="99" w:unhideWhenUsed="1"/>
-    <w:lsdException w:name="Unresolved Mention" w:semiHidden="1" w:uiPriority="99" w:unhideWhenUsed="1"/>
-    <w:lsdException w:name="Smart Link" w:semiHidden="1" w:uiPriority="99" w:unhideWhenUsed="1"/>
+    <w:lsdException w:name="Mention" w:uiPriority="99" w:semiHidden="1" w:unhideWhenUsed="1"/>
+    <w:lsdException w:name="Smart Hyperlink" w:uiPriority="99" w:semiHidden="1" w:unhideWhenUsed="1"/>
+    <w:lsdException w:name="Hashtag" w:uiPriority="99" w:semiHidden="1" w:unhideWhenUsed="1"/>
+    <w:lsdException w:name="Unresolved Mention" w:uiPriority="99" w:semiHidden="1" w:unhideWhenUsed="1"/>
+    <w:lsdException w:name="Smart Link" w:uiPriority="99" w:semiHidden="1" w:unhideWhenUsed="1"/>
   </w:latentStyles>
-  <w:style w:default="1" w:styleId="Normal" w:type="paragraph">
+  <w:style w:type="paragraph" w:styleId="Normal" w:default="1">
     <w:name w:val="Normal"/>
     <w:qFormat/>
     <w:pPr>
       <w:widowControl/>
+      <w:suppressAutoHyphens w:val="true"/>
       <w:bidi w:val="0"/>
-      <w:spacing w:after="200" w:before="0"/>
+      <w:spacing w:before="0" w:after="200"/>
       <w:jc w:val="start"/>
     </w:pPr>
     <w:rPr>
-      <w:rFonts w:ascii="Aptos" w:asciiTheme="minorHAnsi" w:cs="" w:cstheme="minorBidi" w:eastAsia="Aptos" w:eastAsiaTheme="minorHAnsi" w:hAnsi="Aptos" w:hAnsiTheme="minorHAnsi"/>
+      <w:rFonts w:ascii="Aptos" w:hAnsi="Aptos" w:eastAsia="Aptos" w:cs="" w:asciiTheme="minorHAnsi" w:cstheme="minorBidi" w:eastAsiaTheme="minorHAnsi" w:hAnsiTheme="minorHAnsi"/>
       <w:color w:val="auto"/>
       <w:kern w:val="0"/>
       <w:sz w:val="24"/>
       <w:szCs w:val="24"/>
-      <w:lang w:bidi="ar-SA" w:eastAsia="en-US" w:val="es"/>
-    </w:rPr>
-  </w:style>
-  <w:style w:styleId="Heading1" w:type="paragraph">
+      <w:lang w:val="es-ES" w:eastAsia="en-US" w:bidi="ar-SA"/>
+    </w:rPr>
+  </w:style>
+  <w:style w:type="paragraph" w:styleId="Heading1">
     <w:name w:val="heading 1"/>
     <w:basedOn w:val="Normal"/>
     <w:next w:val="BodyText"/>
@@ -1142,17 +1237,17 @@
     <w:pPr>
       <w:keepNext w:val="true"/>
       <w:keepLines/>
-      <w:spacing w:after="240" w:before="0"/>
+      <w:spacing w:before="0" w:after="240"/>
       <w:outlineLvl w:val="0"/>
     </w:pPr>
     <w:rPr>
-      <w:rFonts w:ascii="Aptos Display" w:asciiTheme="majorHAnsi" w:cs="" w:cstheme="majorBidi" w:eastAsia="" w:eastAsiaTheme="majorEastAsia" w:hAnsi="Aptos Display" w:hAnsiTheme="majorHAnsi"/>
+      <w:rFonts w:ascii="Aptos Display" w:hAnsi="Aptos Display" w:eastAsia="" w:cs="" w:asciiTheme="majorHAnsi" w:cstheme="majorBidi" w:eastAsiaTheme="majorEastAsia" w:hAnsiTheme="majorHAnsi"/>
       <w:color w:themeColor="accent1" w:themeShade="bf" w:val="0F4761"/>
       <w:sz w:val="40"/>
       <w:szCs w:val="40"/>
     </w:rPr>
   </w:style>
-  <w:style w:styleId="Heading2" w:type="paragraph">
+  <w:style w:type="paragraph" w:styleId="Heading2">
     <w:name w:val="heading 2"/>
     <w:basedOn w:val="Normal"/>
     <w:next w:val="BodyText"/>
@@ -1165,17 +1260,17 @@
     <w:pPr>
       <w:keepNext w:val="true"/>
       <w:keepLines/>
-      <w:spacing w:after="240" w:before="0"/>
+      <w:spacing w:before="0" w:after="240"/>
       <w:outlineLvl w:val="1"/>
     </w:pPr>
     <w:rPr>
-      <w:rFonts w:ascii="Aptos Display" w:asciiTheme="majorHAnsi" w:cs="" w:cstheme="majorBidi" w:eastAsia="" w:eastAsiaTheme="majorEastAsia" w:hAnsi="Aptos Display" w:hAnsiTheme="majorHAnsi"/>
+      <w:rFonts w:ascii="Aptos Display" w:hAnsi="Aptos Display" w:eastAsia="" w:cs="" w:asciiTheme="majorHAnsi" w:cstheme="majorBidi" w:eastAsiaTheme="majorEastAsia" w:hAnsiTheme="majorHAnsi"/>
       <w:color w:themeColor="accent1" w:themeShade="bf" w:val="0F4761"/>
       <w:sz w:val="32"/>
       <w:szCs w:val="32"/>
     </w:rPr>
   </w:style>
-  <w:style w:styleId="Heading3" w:type="paragraph">
+  <w:style w:type="paragraph" w:styleId="Heading3">
     <w:name w:val="heading 3"/>
     <w:basedOn w:val="Normal"/>
     <w:next w:val="BodyText"/>
@@ -1188,17 +1283,17 @@
     <w:pPr>
       <w:keepNext w:val="true"/>
       <w:keepLines/>
-      <w:spacing w:after="240" w:before="0"/>
+      <w:spacing w:before="0" w:after="240"/>
       <w:outlineLvl w:val="2"/>
     </w:pPr>
     <w:rPr>
-      <w:rFonts w:cs="" w:cstheme="majorBidi" w:eastAsia="" w:eastAsiaTheme="majorEastAsia"/>
+      <w:rFonts w:eastAsia="" w:cs="" w:cstheme="majorBidi" w:eastAsiaTheme="majorEastAsia"/>
       <w:color w:themeColor="accent1" w:themeShade="bf" w:val="0F4761"/>
       <w:sz w:val="28"/>
       <w:szCs w:val="28"/>
     </w:rPr>
   </w:style>
-  <w:style w:styleId="Heading4" w:type="paragraph">
+  <w:style w:type="paragraph" w:styleId="Heading4">
     <w:name w:val="heading 4"/>
     <w:basedOn w:val="Normal"/>
     <w:next w:val="BodyText"/>
@@ -1211,17 +1306,17 @@
     <w:pPr>
       <w:keepNext w:val="true"/>
       <w:keepLines/>
-      <w:spacing w:after="40" w:before="80"/>
+      <w:spacing w:before="80" w:after="40"/>
       <w:outlineLvl w:val="3"/>
     </w:pPr>
     <w:rPr>
-      <w:rFonts w:cs="" w:cstheme="majorBidi" w:eastAsia="" w:eastAsiaTheme="majorEastAsia"/>
+      <w:rFonts w:eastAsia="" w:cs="" w:cstheme="majorBidi" w:eastAsiaTheme="majorEastAsia"/>
       <w:i/>
       <w:iCs/>
       <w:color w:themeColor="accent1" w:themeShade="bf" w:val="0F4761"/>
     </w:rPr>
   </w:style>
-  <w:style w:styleId="Heading5" w:type="paragraph">
+  <w:style w:type="paragraph" w:styleId="Heading5">
     <w:name w:val="heading 5"/>
     <w:basedOn w:val="Normal"/>
     <w:next w:val="BodyText"/>
@@ -1234,15 +1329,15 @@
     <w:pPr>
       <w:keepNext w:val="true"/>
       <w:keepLines/>
-      <w:spacing w:after="40" w:before="80"/>
+      <w:spacing w:before="80" w:after="40"/>
       <w:outlineLvl w:val="4"/>
     </w:pPr>
     <w:rPr>
-      <w:rFonts w:cs="" w:cstheme="majorBidi" w:eastAsia="" w:eastAsiaTheme="majorEastAsia"/>
+      <w:rFonts w:eastAsia="" w:cs="" w:cstheme="majorBidi" w:eastAsiaTheme="majorEastAsia"/>
       <w:color w:themeColor="accent1" w:themeShade="bf" w:val="0F4761"/>
     </w:rPr>
   </w:style>
-  <w:style w:styleId="Heading6" w:type="paragraph">
+  <w:style w:type="paragraph" w:styleId="Heading6">
     <w:name w:val="heading 6"/>
     <w:basedOn w:val="Normal"/>
     <w:next w:val="BodyText"/>
@@ -1255,17 +1350,17 @@
     <w:pPr>
       <w:keepNext w:val="true"/>
       <w:keepLines/>
-      <w:spacing w:after="0" w:before="40"/>
+      <w:spacing w:before="40" w:after="0"/>
       <w:outlineLvl w:val="5"/>
     </w:pPr>
     <w:rPr>
-      <w:rFonts w:cs="" w:cstheme="majorBidi" w:eastAsia="" w:eastAsiaTheme="majorEastAsia"/>
+      <w:rFonts w:eastAsia="" w:cs="" w:cstheme="majorBidi" w:eastAsiaTheme="majorEastAsia"/>
       <w:i/>
       <w:iCs/>
       <w:color w:themeColor="text1" w:themeTint="a6" w:val="595959"/>
     </w:rPr>
   </w:style>
-  <w:style w:styleId="Heading7" w:type="paragraph">
+  <w:style w:type="paragraph" w:styleId="Heading7">
     <w:name w:val="heading 7"/>
     <w:basedOn w:val="Normal"/>
     <w:next w:val="BodyText"/>
@@ -1278,15 +1373,15 @@
     <w:pPr>
       <w:keepNext w:val="true"/>
       <w:keepLines/>
-      <w:spacing w:after="0" w:before="40"/>
+      <w:spacing w:before="40" w:after="0"/>
       <w:outlineLvl w:val="6"/>
     </w:pPr>
     <w:rPr>
-      <w:rFonts w:cs="" w:cstheme="majorBidi" w:eastAsia="" w:eastAsiaTheme="majorEastAsia"/>
+      <w:rFonts w:eastAsia="" w:cs="" w:cstheme="majorBidi" w:eastAsiaTheme="majorEastAsia"/>
       <w:color w:themeColor="text1" w:themeTint="a6" w:val="595959"/>
     </w:rPr>
   </w:style>
-  <w:style w:styleId="Heading8" w:type="paragraph">
+  <w:style w:type="paragraph" w:styleId="Heading8">
     <w:name w:val="heading 8"/>
     <w:basedOn w:val="Normal"/>
     <w:next w:val="BodyText"/>
@@ -1299,17 +1394,17 @@
     <w:pPr>
       <w:keepNext w:val="true"/>
       <w:keepLines/>
-      <w:spacing w:after="0" w:before="0"/>
+      <w:spacing w:before="0" w:after="0"/>
       <w:outlineLvl w:val="7"/>
     </w:pPr>
     <w:rPr>
-      <w:rFonts w:cs="" w:cstheme="majorBidi" w:eastAsia="" w:eastAsiaTheme="majorEastAsia"/>
+      <w:rFonts w:eastAsia="" w:cs="" w:cstheme="majorBidi" w:eastAsiaTheme="majorEastAsia"/>
       <w:i/>
       <w:iCs/>
       <w:color w:themeColor="text1" w:themeTint="d8" w:val="272727"/>
     </w:rPr>
   </w:style>
-  <w:style w:styleId="Heading9" w:type="paragraph">
+  <w:style w:type="paragraph" w:styleId="Heading9">
     <w:name w:val="heading 9"/>
     <w:basedOn w:val="Normal"/>
     <w:next w:val="BodyText"/>
@@ -1322,15 +1417,15 @@
     <w:pPr>
       <w:keepNext w:val="true"/>
       <w:keepLines/>
-      <w:spacing w:after="0" w:before="0"/>
+      <w:spacing w:before="0" w:after="0"/>
       <w:outlineLvl w:val="8"/>
     </w:pPr>
     <w:rPr>
-      <w:rFonts w:cs="" w:cstheme="majorBidi" w:eastAsia="" w:eastAsiaTheme="majorEastAsia"/>
+      <w:rFonts w:eastAsia="" w:cs="" w:cstheme="majorBidi" w:eastAsiaTheme="majorEastAsia"/>
       <w:color w:themeColor="text1" w:themeTint="d8" w:val="272727"/>
     </w:rPr>
   </w:style>
-  <w:style w:default="1" w:styleId="DefaultParagraphFont" w:type="character">
+  <w:style w:type="character" w:styleId="DefaultParagraphFont" w:default="1">
     <w:name w:val="Default Paragraph Font"/>
     <w:uiPriority w:val="1"/>
     <w:semiHidden/>
@@ -1338,7 +1433,7 @@
     <w:qFormat/>
     <w:rPr/>
   </w:style>
-  <w:style w:customStyle="1" w:styleId="TitleChar" w:type="character">
+  <w:style w:type="character" w:styleId="TitleChar" w:customStyle="1">
     <w:name w:val="Title Char"/>
     <w:basedOn w:val="DefaultParagraphFont"/>
     <w:link w:val="Title"/>
@@ -1346,12 +1441,12 @@
     <w:qFormat/>
     <w:rsid w:val="00a10fd9"/>
     <w:rPr>
-      <w:rFonts w:ascii="Aptos Display" w:asciiTheme="majorHAnsi" w:cs="" w:cstheme="majorBidi" w:eastAsia="" w:eastAsiaTheme="majorEastAsia" w:hAnsi="Aptos Display" w:hAnsiTheme="majorHAnsi"/>
+      <w:rFonts w:ascii="Aptos Display" w:hAnsi="Aptos Display" w:eastAsia="" w:cs="" w:asciiTheme="majorHAnsi" w:cstheme="majorBidi" w:eastAsiaTheme="majorEastAsia" w:hAnsiTheme="majorHAnsi"/>
       <w:sz w:val="56"/>
       <w:szCs w:val="56"/>
     </w:rPr>
   </w:style>
-  <w:style w:customStyle="1" w:styleId="SubtitleChar" w:type="character">
+  <w:style w:type="character" w:styleId="SubtitleChar" w:customStyle="1">
     <w:name w:val="Subtitle Char"/>
     <w:basedOn w:val="DefaultParagraphFont"/>
     <w:link w:val="Subtitle"/>
@@ -1359,14 +1454,14 @@
     <w:qFormat/>
     <w:rsid w:val="00a10fd9"/>
     <w:rPr>
-      <w:rFonts w:cs="" w:cstheme="majorBidi" w:eastAsia="" w:eastAsiaTheme="majorEastAsia"/>
+      <w:rFonts w:eastAsia="" w:cs="" w:cstheme="majorBidi" w:eastAsiaTheme="majorEastAsia"/>
       <w:color w:themeColor="text1" w:themeTint="a6" w:val="595959"/>
       <w:spacing w:val="15"/>
       <w:sz w:val="28"/>
       <w:szCs w:val="28"/>
     </w:rPr>
   </w:style>
-  <w:style w:customStyle="1" w:styleId="Heading1Char" w:type="character">
+  <w:style w:type="character" w:styleId="Heading1Char" w:customStyle="1">
     <w:name w:val="Heading 1 Char"/>
     <w:basedOn w:val="DefaultParagraphFont"/>
     <w:link w:val="Heading1"/>
@@ -1374,13 +1469,13 @@
     <w:qFormat/>
     <w:rsid w:val="0003144b"/>
     <w:rPr>
-      <w:rFonts w:ascii="Aptos Display" w:asciiTheme="majorHAnsi" w:cs="" w:cstheme="majorBidi" w:eastAsia="" w:eastAsiaTheme="majorEastAsia" w:hAnsi="Aptos Display" w:hAnsiTheme="majorHAnsi"/>
+      <w:rFonts w:ascii="Aptos Display" w:hAnsi="Aptos Display" w:eastAsia="" w:cs="" w:asciiTheme="majorHAnsi" w:cstheme="majorBidi" w:eastAsiaTheme="majorEastAsia" w:hAnsiTheme="majorHAnsi"/>
       <w:color w:themeColor="accent1" w:themeShade="bf" w:val="0F4761"/>
       <w:sz w:val="40"/>
       <w:szCs w:val="40"/>
     </w:rPr>
   </w:style>
-  <w:style w:customStyle="1" w:styleId="Heading2Char" w:type="character">
+  <w:style w:type="character" w:styleId="Heading2Char" w:customStyle="1">
     <w:name w:val="Heading 2 Char"/>
     <w:basedOn w:val="DefaultParagraphFont"/>
     <w:link w:val="Heading2"/>
@@ -1389,13 +1484,13 @@
     <w:qFormat/>
     <w:rsid w:val="000570ce"/>
     <w:rPr>
-      <w:rFonts w:ascii="Aptos Display" w:asciiTheme="majorHAnsi" w:cs="" w:cstheme="majorBidi" w:eastAsia="" w:eastAsiaTheme="majorEastAsia" w:hAnsi="Aptos Display" w:hAnsiTheme="majorHAnsi"/>
+      <w:rFonts w:ascii="Aptos Display" w:hAnsi="Aptos Display" w:eastAsia="" w:cs="" w:asciiTheme="majorHAnsi" w:cstheme="majorBidi" w:eastAsiaTheme="majorEastAsia" w:hAnsiTheme="majorHAnsi"/>
       <w:color w:themeColor="accent1" w:themeShade="bf" w:val="0F4761"/>
       <w:sz w:val="32"/>
       <w:szCs w:val="32"/>
     </w:rPr>
   </w:style>
-  <w:style w:customStyle="1" w:styleId="Heading3Char" w:type="character">
+  <w:style w:type="character" w:styleId="Heading3Char" w:customStyle="1">
     <w:name w:val="Heading 3 Char"/>
     <w:basedOn w:val="DefaultParagraphFont"/>
     <w:link w:val="Heading3"/>
@@ -1404,13 +1499,13 @@
     <w:qFormat/>
     <w:rsid w:val="000570ce"/>
     <w:rPr>
-      <w:rFonts w:cs="" w:cstheme="majorBidi" w:eastAsia="" w:eastAsiaTheme="majorEastAsia"/>
+      <w:rFonts w:eastAsia="" w:cs="" w:cstheme="majorBidi" w:eastAsiaTheme="majorEastAsia"/>
       <w:color w:themeColor="accent1" w:themeShade="bf" w:val="0F4761"/>
       <w:sz w:val="28"/>
       <w:szCs w:val="28"/>
     </w:rPr>
   </w:style>
-  <w:style w:customStyle="1" w:styleId="Heading4Char" w:type="character">
+  <w:style w:type="character" w:styleId="Heading4Char" w:customStyle="1">
     <w:name w:val="Heading 4 Char"/>
     <w:basedOn w:val="DefaultParagraphFont"/>
     <w:link w:val="Heading4"/>
@@ -1419,13 +1514,13 @@
     <w:qFormat/>
     <w:rsid w:val="00a10fd9"/>
     <w:rPr>
-      <w:rFonts w:cs="" w:cstheme="majorBidi" w:eastAsia="" w:eastAsiaTheme="majorEastAsia"/>
+      <w:rFonts w:eastAsia="" w:cs="" w:cstheme="majorBidi" w:eastAsiaTheme="majorEastAsia"/>
       <w:i/>
       <w:iCs/>
       <w:color w:themeColor="accent1" w:themeShade="bf" w:val="0F4761"/>
     </w:rPr>
   </w:style>
-  <w:style w:customStyle="1" w:styleId="Heading5Char" w:type="character">
+  <w:style w:type="character" w:styleId="Heading5Char" w:customStyle="1">
     <w:name w:val="Heading 5 Char"/>
     <w:basedOn w:val="DefaultParagraphFont"/>
     <w:link w:val="Heading5"/>
@@ -1434,11 +1529,11 @@
     <w:qFormat/>
     <w:rsid w:val="00a10fd9"/>
     <w:rPr>
-      <w:rFonts w:cs="" w:cstheme="majorBidi" w:eastAsia="" w:eastAsiaTheme="majorEastAsia"/>
+      <w:rFonts w:eastAsia="" w:cs="" w:cstheme="majorBidi" w:eastAsiaTheme="majorEastAsia"/>
       <w:color w:themeColor="accent1" w:themeShade="bf" w:val="0F4761"/>
     </w:rPr>
   </w:style>
-  <w:style w:customStyle="1" w:styleId="Heading6Char" w:type="character">
+  <w:style w:type="character" w:styleId="Heading6Char" w:customStyle="1">
     <w:name w:val="Heading 6 Char"/>
     <w:basedOn w:val="DefaultParagraphFont"/>
     <w:link w:val="Heading6"/>
@@ -1447,13 +1542,13 @@
     <w:qFormat/>
     <w:rsid w:val="00a10fd9"/>
     <w:rPr>
-      <w:rFonts w:cs="" w:cstheme="majorBidi" w:eastAsia="" w:eastAsiaTheme="majorEastAsia"/>
+      <w:rFonts w:eastAsia="" w:cs="" w:cstheme="majorBidi" w:eastAsiaTheme="majorEastAsia"/>
       <w:i/>
       <w:iCs/>
       <w:color w:themeColor="text1" w:themeTint="a6" w:val="595959"/>
     </w:rPr>
   </w:style>
-  <w:style w:customStyle="1" w:styleId="Heading7Char" w:type="character">
+  <w:style w:type="character" w:styleId="Heading7Char" w:customStyle="1">
     <w:name w:val="Heading 7 Char"/>
     <w:basedOn w:val="DefaultParagraphFont"/>
     <w:link w:val="Heading7"/>
@@ -1462,11 +1557,11 @@
     <w:qFormat/>
     <w:rsid w:val="00a10fd9"/>
     <w:rPr>
-      <w:rFonts w:cs="" w:cstheme="majorBidi" w:eastAsia="" w:eastAsiaTheme="majorEastAsia"/>
+      <w:rFonts w:eastAsia="" w:cs="" w:cstheme="majorBidi" w:eastAsiaTheme="majorEastAsia"/>
       <w:color w:themeColor="text1" w:themeTint="a6" w:val="595959"/>
     </w:rPr>
   </w:style>
-  <w:style w:customStyle="1" w:styleId="Heading8Char" w:type="character">
+  <w:style w:type="character" w:styleId="Heading8Char" w:customStyle="1">
     <w:name w:val="Heading 8 Char"/>
     <w:basedOn w:val="DefaultParagraphFont"/>
     <w:link w:val="Heading8"/>
@@ -1475,13 +1570,13 @@
     <w:qFormat/>
     <w:rsid w:val="00a10fd9"/>
     <w:rPr>
-      <w:rFonts w:cs="" w:cstheme="majorBidi" w:eastAsia="" w:eastAsiaTheme="majorEastAsia"/>
+      <w:rFonts w:eastAsia="" w:cs="" w:cstheme="majorBidi" w:eastAsiaTheme="majorEastAsia"/>
       <w:i/>
       <w:iCs/>
       <w:color w:themeColor="text1" w:themeTint="d8" w:val="272727"/>
     </w:rPr>
   </w:style>
-  <w:style w:customStyle="1" w:styleId="Heading9Char" w:type="character">
+  <w:style w:type="character" w:styleId="Heading9Char" w:customStyle="1">
     <w:name w:val="Heading 9 Char"/>
     <w:basedOn w:val="DefaultParagraphFont"/>
     <w:link w:val="Heading9"/>
@@ -1490,18 +1585,18 @@
     <w:qFormat/>
     <w:rsid w:val="00a10fd9"/>
     <w:rPr>
-      <w:rFonts w:cs="" w:cstheme="majorBidi" w:eastAsia="" w:eastAsiaTheme="majorEastAsia"/>
+      <w:rFonts w:eastAsia="" w:cs="" w:cstheme="majorBidi" w:eastAsiaTheme="majorEastAsia"/>
       <w:color w:themeColor="text1" w:themeTint="d8" w:val="272727"/>
     </w:rPr>
   </w:style>
-  <w:style w:customStyle="1" w:styleId="CaptionChar" w:type="character">
+  <w:style w:type="character" w:styleId="CaptionChar" w:customStyle="1">
     <w:name w:val="Caption Char"/>
     <w:basedOn w:val="DefaultParagraphFont"/>
     <w:link w:val="Caption"/>
     <w:qFormat/>
     <w:rPr/>
   </w:style>
-  <w:style w:customStyle="1" w:styleId="VerbatimChar" w:type="character">
+  <w:style w:type="character" w:styleId="VerbatimChar" w:customStyle="1">
     <w:name w:val="Verbatim Char"/>
     <w:basedOn w:val="CaptionChar"/>
     <w:link w:val="SourceCode"/>
@@ -1511,27 +1606,34 @@
       <w:sz w:val="22"/>
     </w:rPr>
   </w:style>
-  <w:style w:customStyle="1" w:styleId="SectionNumber" w:type="character">
+  <w:style w:type="character" w:styleId="SectionNumber" w:customStyle="1">
     <w:name w:val="Section Number"/>
     <w:basedOn w:val="CaptionChar"/>
     <w:qFormat/>
     <w:rPr/>
   </w:style>
-  <w:style w:styleId="FootnoteCharacters" w:type="character">
+  <w:style w:type="character" w:styleId="FootnoteCharactersuser">
+    <w:name w:val="Footnote Characters (user)"/>
+    <w:basedOn w:val="CaptionChar"/>
+    <w:qFormat/>
+    <w:rPr>
+      <w:vertAlign w:val="superscript"/>
+    </w:rPr>
+  </w:style>
+  <w:style w:type="character" w:styleId="FootnoteCharacters">
     <w:name w:val="Footnote Characters"/>
-    <w:basedOn w:val="CaptionChar"/>
     <w:qFormat/>
     <w:rPr>
       <w:vertAlign w:val="superscript"/>
     </w:rPr>
   </w:style>
-  <w:style w:styleId="FootnoteReference" w:type="character">
+  <w:style w:type="character" w:styleId="FootnoteReference">
     <w:name w:val="footnote reference"/>
     <w:rPr>
       <w:vertAlign w:val="superscript"/>
     </w:rPr>
   </w:style>
-  <w:style w:styleId="Hyperlink" w:type="character">
+  <w:style w:type="character" w:styleId="Hyperlink">
     <w:name w:val="Hyperlink"/>
     <w:basedOn w:val="CaptionChar"/>
     <w:uiPriority w:val="99"/>
@@ -1539,7 +1641,7 @@
       <w:color w:themeColor="accent1" w:val="156082"/>
     </w:rPr>
   </w:style>
-  <w:style w:customStyle="1" w:styleId="KeywordTok" w:type="character">
+  <w:style w:type="character" w:styleId="KeywordTok" w:customStyle="1">
     <w:name w:val="KeywordTok"/>
     <w:basedOn w:val="VerbatimChar"/>
     <w:qFormat/>
@@ -1551,7 +1653,7 @@
       <w:shd w:fill="F1F3F5" w:val="clear"/>
     </w:rPr>
   </w:style>
-  <w:style w:customStyle="1" w:styleId="DataTypeTok" w:type="character">
+  <w:style w:type="character" w:styleId="DataTypeTok" w:customStyle="1">
     <w:name w:val="DataTypeTok"/>
     <w:basedOn w:val="VerbatimChar"/>
     <w:qFormat/>
@@ -1562,7 +1664,7 @@
       <w:shd w:fill="F1F3F5" w:val="clear"/>
     </w:rPr>
   </w:style>
-  <w:style w:customStyle="1" w:styleId="DecValTok" w:type="character">
+  <w:style w:type="character" w:styleId="DecValTok" w:customStyle="1">
     <w:name w:val="DecValTok"/>
     <w:basedOn w:val="VerbatimChar"/>
     <w:qFormat/>
@@ -1573,7 +1675,7 @@
       <w:shd w:fill="F1F3F5" w:val="clear"/>
     </w:rPr>
   </w:style>
-  <w:style w:customStyle="1" w:styleId="BaseNTok" w:type="character">
+  <w:style w:type="character" w:styleId="BaseNTok" w:customStyle="1">
     <w:name w:val="BaseNTok"/>
     <w:basedOn w:val="VerbatimChar"/>
     <w:qFormat/>
@@ -1584,7 +1686,7 @@
       <w:shd w:fill="F1F3F5" w:val="clear"/>
     </w:rPr>
   </w:style>
-  <w:style w:customStyle="1" w:styleId="FloatTok" w:type="character">
+  <w:style w:type="character" w:styleId="FloatTok" w:customStyle="1">
     <w:name w:val="FloatTok"/>
     <w:basedOn w:val="VerbatimChar"/>
     <w:qFormat/>
@@ -1595,7 +1697,7 @@
       <w:shd w:fill="F1F3F5" w:val="clear"/>
     </w:rPr>
   </w:style>
-  <w:style w:customStyle="1" w:styleId="ConstantTok" w:type="character">
+  <w:style w:type="character" w:styleId="ConstantTok" w:customStyle="1">
     <w:name w:val="ConstantTok"/>
     <w:basedOn w:val="VerbatimChar"/>
     <w:qFormat/>
@@ -1606,7 +1708,7 @@
       <w:shd w:fill="F1F3F5" w:val="clear"/>
     </w:rPr>
   </w:style>
-  <w:style w:customStyle="1" w:styleId="CharTok" w:type="character">
+  <w:style w:type="character" w:styleId="CharTok" w:customStyle="1">
     <w:name w:val="CharTok"/>
     <w:basedOn w:val="VerbatimChar"/>
     <w:qFormat/>
@@ -1617,7 +1719,7 @@
       <w:shd w:fill="F1F3F5" w:val="clear"/>
     </w:rPr>
   </w:style>
-  <w:style w:customStyle="1" w:styleId="SpecialCharTok" w:type="character">
+  <w:style w:type="character" w:styleId="SpecialCharTok" w:customStyle="1">
     <w:name w:val="SpecialCharTok"/>
     <w:basedOn w:val="VerbatimChar"/>
     <w:qFormat/>
@@ -1628,7 +1730,7 @@
       <w:shd w:fill="F1F3F5" w:val="clear"/>
     </w:rPr>
   </w:style>
-  <w:style w:customStyle="1" w:styleId="StringTok" w:type="character">
+  <w:style w:type="character" w:styleId="StringTok" w:customStyle="1">
     <w:name w:val="StringTok"/>
     <w:basedOn w:val="VerbatimChar"/>
     <w:qFormat/>
@@ -1639,7 +1741,7 @@
       <w:shd w:fill="F1F3F5" w:val="clear"/>
     </w:rPr>
   </w:style>
-  <w:style w:customStyle="1" w:styleId="VerbatimStringTok" w:type="character">
+  <w:style w:type="character" w:styleId="VerbatimStringTok" w:customStyle="1">
     <w:name w:val="VerbatimStringTok"/>
     <w:basedOn w:val="VerbatimChar"/>
     <w:qFormat/>
@@ -1650,7 +1752,7 @@
       <w:shd w:fill="F1F3F5" w:val="clear"/>
     </w:rPr>
   </w:style>
-  <w:style w:customStyle="1" w:styleId="SpecialStringTok" w:type="character">
+  <w:style w:type="character" w:styleId="SpecialStringTok" w:customStyle="1">
     <w:name w:val="SpecialStringTok"/>
     <w:basedOn w:val="VerbatimChar"/>
     <w:qFormat/>
@@ -1661,7 +1763,7 @@
       <w:shd w:fill="F1F3F5" w:val="clear"/>
     </w:rPr>
   </w:style>
-  <w:style w:customStyle="1" w:styleId="ImportTok" w:type="character">
+  <w:style w:type="character" w:styleId="ImportTok" w:customStyle="1">
     <w:name w:val="ImportTok"/>
     <w:basedOn w:val="VerbatimChar"/>
     <w:qFormat/>
@@ -1672,7 +1774,7 @@
       <w:shd w:fill="F1F3F5" w:val="clear"/>
     </w:rPr>
   </w:style>
-  <w:style w:customStyle="1" w:styleId="CommentTok" w:type="character">
+  <w:style w:type="character" w:styleId="CommentTok" w:customStyle="1">
     <w:name w:val="CommentTok"/>
     <w:basedOn w:val="VerbatimChar"/>
     <w:qFormat/>
@@ -1683,7 +1785,7 @@
       <w:shd w:fill="F1F3F5" w:val="clear"/>
     </w:rPr>
   </w:style>
-  <w:style w:customStyle="1" w:styleId="DocumentationTok" w:type="character">
+  <w:style w:type="character" w:styleId="DocumentationTok" w:customStyle="1">
     <w:name w:val="DocumentationTok"/>
     <w:basedOn w:val="VerbatimChar"/>
     <w:qFormat/>
@@ -1695,7 +1797,7 @@
       <w:shd w:fill="F1F3F5" w:val="clear"/>
     </w:rPr>
   </w:style>
-  <w:style w:customStyle="1" w:styleId="AnnotationTok" w:type="character">
+  <w:style w:type="character" w:styleId="AnnotationTok" w:customStyle="1">
     <w:name w:val="AnnotationTok"/>
     <w:basedOn w:val="VerbatimChar"/>
     <w:qFormat/>
@@ -1706,7 +1808,7 @@
       <w:shd w:fill="F1F3F5" w:val="clear"/>
     </w:rPr>
   </w:style>
-  <w:style w:customStyle="1" w:styleId="CommentVarTok" w:type="character">
+  <w:style w:type="character" w:styleId="CommentVarTok" w:customStyle="1">
     <w:name w:val="CommentVarTok"/>
     <w:basedOn w:val="VerbatimChar"/>
     <w:qFormat/>
@@ -1718,7 +1820,7 @@
       <w:shd w:fill="F1F3F5" w:val="clear"/>
     </w:rPr>
   </w:style>
-  <w:style w:customStyle="1" w:styleId="OtherTok" w:type="character">
+  <w:style w:type="character" w:styleId="OtherTok" w:customStyle="1">
     <w:name w:val="OtherTok"/>
     <w:basedOn w:val="VerbatimChar"/>
     <w:qFormat/>
@@ -1729,7 +1831,7 @@
       <w:shd w:fill="F1F3F5" w:val="clear"/>
     </w:rPr>
   </w:style>
-  <w:style w:customStyle="1" w:styleId="FunctionTok" w:type="character">
+  <w:style w:type="character" w:styleId="FunctionTok" w:customStyle="1">
     <w:name w:val="FunctionTok"/>
     <w:basedOn w:val="VerbatimChar"/>
     <w:qFormat/>
@@ -1740,7 +1842,7 @@
       <w:shd w:fill="F1F3F5" w:val="clear"/>
     </w:rPr>
   </w:style>
-  <w:style w:customStyle="1" w:styleId="VariableTok" w:type="character">
+  <w:style w:type="character" w:styleId="VariableTok" w:customStyle="1">
     <w:name w:val="VariableTok"/>
     <w:basedOn w:val="VerbatimChar"/>
     <w:qFormat/>
@@ -1751,7 +1853,7 @@
       <w:shd w:fill="F1F3F5" w:val="clear"/>
     </w:rPr>
   </w:style>
-  <w:style w:customStyle="1" w:styleId="ControlFlowTok" w:type="character">
+  <w:style w:type="character" w:styleId="ControlFlowTok" w:customStyle="1">
     <w:name w:val="ControlFlowTok"/>
     <w:basedOn w:val="VerbatimChar"/>
     <w:qFormat/>
@@ -1763,7 +1865,7 @@
       <w:shd w:fill="F1F3F5" w:val="clear"/>
     </w:rPr>
   </w:style>
-  <w:style w:customStyle="1" w:styleId="OperatorTok" w:type="character">
+  <w:style w:type="character" w:styleId="OperatorTok" w:customStyle="1">
     <w:name w:val="OperatorTok"/>
     <w:basedOn w:val="VerbatimChar"/>
     <w:qFormat/>
@@ -1774,7 +1876,7 @@
       <w:shd w:fill="F1F3F5" w:val="clear"/>
     </w:rPr>
   </w:style>
-  <w:style w:customStyle="1" w:styleId="BuiltInTok" w:type="character">
+  <w:style w:type="character" w:styleId="BuiltInTok" w:customStyle="1">
     <w:name w:val="BuiltInTok"/>
     <w:basedOn w:val="VerbatimChar"/>
     <w:qFormat/>
@@ -1785,7 +1887,7 @@
       <w:shd w:fill="F1F3F5" w:val="clear"/>
     </w:rPr>
   </w:style>
-  <w:style w:customStyle="1" w:styleId="ExtensionTok" w:type="character">
+  <w:style w:type="character" w:styleId="ExtensionTok" w:customStyle="1">
     <w:name w:val="ExtensionTok"/>
     <w:basedOn w:val="VerbatimChar"/>
     <w:qFormat/>
@@ -1796,7 +1898,7 @@
       <w:shd w:fill="F1F3F5" w:val="clear"/>
     </w:rPr>
   </w:style>
-  <w:style w:customStyle="1" w:styleId="PreprocessorTok" w:type="character">
+  <w:style w:type="character" w:styleId="PreprocessorTok" w:customStyle="1">
     <w:name w:val="PreprocessorTok"/>
     <w:basedOn w:val="VerbatimChar"/>
     <w:qFormat/>
@@ -1807,7 +1909,7 @@
       <w:shd w:fill="F1F3F5" w:val="clear"/>
     </w:rPr>
   </w:style>
-  <w:style w:customStyle="1" w:styleId="AttributeTok" w:type="character">
+  <w:style w:type="character" w:styleId="AttributeTok" w:customStyle="1">
     <w:name w:val="AttributeTok"/>
     <w:basedOn w:val="VerbatimChar"/>
     <w:qFormat/>
@@ -1818,7 +1920,7 @@
       <w:shd w:fill="F1F3F5" w:val="clear"/>
     </w:rPr>
   </w:style>
-  <w:style w:customStyle="1" w:styleId="RegionMarkerTok" w:type="character">
+  <w:style w:type="character" w:styleId="RegionMarkerTok" w:customStyle="1">
     <w:name w:val="RegionMarkerTok"/>
     <w:basedOn w:val="VerbatimChar"/>
     <w:qFormat/>
@@ -1829,7 +1931,7 @@
       <w:shd w:fill="F1F3F5" w:val="clear"/>
     </w:rPr>
   </w:style>
-  <w:style w:customStyle="1" w:styleId="InformationTok" w:type="character">
+  <w:style w:type="character" w:styleId="InformationTok" w:customStyle="1">
     <w:name w:val="InformationTok"/>
     <w:basedOn w:val="VerbatimChar"/>
     <w:qFormat/>
@@ -1840,7 +1942,7 @@
       <w:shd w:fill="F1F3F5" w:val="clear"/>
     </w:rPr>
   </w:style>
-  <w:style w:customStyle="1" w:styleId="WarningTok" w:type="character">
+  <w:style w:type="character" w:styleId="WarningTok" w:customStyle="1">
     <w:name w:val="WarningTok"/>
     <w:basedOn w:val="VerbatimChar"/>
     <w:qFormat/>
@@ -1852,7 +1954,7 @@
       <w:shd w:fill="F1F3F5" w:val="clear"/>
     </w:rPr>
   </w:style>
-  <w:style w:customStyle="1" w:styleId="AlertTok" w:type="character">
+  <w:style w:type="character" w:styleId="AlertTok" w:customStyle="1">
     <w:name w:val="AlertTok"/>
     <w:basedOn w:val="VerbatimChar"/>
     <w:qFormat/>
@@ -1863,7 +1965,7 @@
       <w:shd w:fill="F1F3F5" w:val="clear"/>
     </w:rPr>
   </w:style>
-  <w:style w:customStyle="1" w:styleId="ErrorTok" w:type="character">
+  <w:style w:type="character" w:styleId="ErrorTok" w:customStyle="1">
     <w:name w:val="ErrorTok"/>
     <w:basedOn w:val="VerbatimChar"/>
     <w:qFormat/>
@@ -1874,7 +1976,7 @@
       <w:shd w:fill="F1F3F5" w:val="clear"/>
     </w:rPr>
   </w:style>
-  <w:style w:customStyle="1" w:styleId="NormalTok" w:type="character">
+  <w:style w:type="character" w:styleId="NormalTok" w:customStyle="1">
     <w:name w:val="NormalTok"/>
     <w:basedOn w:val="VerbatimChar"/>
     <w:qFormat/>
@@ -1885,7 +1987,7 @@
       <w:shd w:fill="F1F3F5" w:val="clear"/>
     </w:rPr>
   </w:style>
-  <w:style w:customStyle="1" w:styleId="HeaderChar" w:type="character">
+  <w:style w:type="character" w:styleId="HeaderChar" w:customStyle="1">
     <w:name w:val="Header Char"/>
     <w:basedOn w:val="DefaultParagraphFont"/>
     <w:link w:val="Header"/>
@@ -1893,7 +1995,7 @@
     <w:rsid w:val="00803c7e"/>
     <w:rPr/>
   </w:style>
-  <w:style w:customStyle="1" w:styleId="FooterChar" w:type="character">
+  <w:style w:type="character" w:styleId="FooterChar" w:customStyle="1">
     <w:name w:val="Footer Char"/>
     <w:basedOn w:val="DefaultParagraphFont"/>
     <w:link w:val="Footer"/>
@@ -1901,7 +2003,7 @@
     <w:rsid w:val="00803c7e"/>
     <w:rPr/>
   </w:style>
-  <w:style w:styleId="FollowedHyperlink" w:type="character">
+  <w:style w:type="character" w:styleId="FollowedHyperlink">
     <w:name w:val="FollowedHyperlink"/>
     <w:basedOn w:val="DefaultParagraphFont"/>
     <w:rsid w:val="000570ce"/>
@@ -1910,38 +2012,38 @@
       <w:u w:val="single"/>
     </w:rPr>
   </w:style>
-  <w:style w:styleId="IndexLink" w:type="character">
+  <w:style w:type="character" w:styleId="IndexLink">
     <w:name w:val="Index Link"/>
     <w:qFormat/>
     <w:rPr/>
   </w:style>
-  <w:style w:styleId="Heading" w:type="paragraph">
+  <w:style w:type="paragraph" w:styleId="Heading">
     <w:name w:val="Heading"/>
     <w:basedOn w:val="Normal"/>
     <w:next w:val="BodyText"/>
     <w:qFormat/>
     <w:pPr>
       <w:keepNext w:val="true"/>
-      <w:spacing w:after="120" w:before="240"/>
-    </w:pPr>
-    <w:rPr>
-      <w:rFonts w:ascii="Liberation Sans" w:cs="Lucida Sans" w:eastAsia="Noto Sans CJK SC" w:hAnsi="Liberation Sans"/>
+      <w:spacing w:before="240" w:after="120"/>
+    </w:pPr>
+    <w:rPr>
+      <w:rFonts w:ascii="Liberation Sans" w:hAnsi="Liberation Sans" w:eastAsia="Noto Sans CJK SC" w:cs="Lucida Sans"/>
       <w:sz w:val="28"/>
       <w:szCs w:val="28"/>
     </w:rPr>
   </w:style>
-  <w:style w:styleId="BodyText" w:type="paragraph">
+  <w:style w:type="paragraph" w:styleId="BodyText">
     <w:name w:val="Body Text"/>
     <w:basedOn w:val="Normal"/>
     <w:qFormat/>
     <w:rsid w:val="0003144b"/>
     <w:pPr>
-      <w:spacing w:after="240" w:before="0"/>
+      <w:spacing w:before="0" w:after="240"/>
       <w:jc w:val="both"/>
     </w:pPr>
     <w:rPr/>
   </w:style>
-  <w:style w:styleId="List" w:type="paragraph">
+  <w:style w:type="paragraph" w:styleId="List">
     <w:name w:val="List"/>
     <w:basedOn w:val="BodyText"/>
     <w:pPr/>
@@ -1949,19 +2051,19 @@
       <w:rFonts w:cs="Lucida Sans"/>
     </w:rPr>
   </w:style>
-  <w:style w:styleId="Caption" w:type="paragraph">
+  <w:style w:type="paragraph" w:styleId="Caption">
     <w:name w:val="caption"/>
     <w:basedOn w:val="Normal"/>
     <w:link w:val="CaptionChar"/>
     <w:qFormat/>
     <w:pPr>
-      <w:spacing w:after="120" w:before="0"/>
+      <w:spacing w:before="0" w:after="120"/>
     </w:pPr>
     <w:rPr>
       <w:i/>
     </w:rPr>
   </w:style>
-  <w:style w:styleId="Index" w:type="paragraph">
+  <w:style w:type="paragraph" w:styleId="Index">
     <w:name w:val="Index"/>
     <w:basedOn w:val="Normal"/>
     <w:qFormat/>
@@ -1972,7 +2074,7 @@
       <w:rFonts w:cs="Lucida Sans"/>
     </w:rPr>
   </w:style>
-  <w:style w:customStyle="1" w:styleId="FirstParagraph" w:type="paragraph">
+  <w:style w:type="paragraph" w:styleId="FirstParagraph" w:customStyle="1">
     <w:name w:val="First Paragraph"/>
     <w:basedOn w:val="BodyText"/>
     <w:next w:val="BodyText"/>
@@ -1981,16 +2083,16 @@
     <w:pPr/>
     <w:rPr/>
   </w:style>
-  <w:style w:customStyle="1" w:styleId="Compact" w:type="paragraph">
+  <w:style w:type="paragraph" w:styleId="Compact" w:customStyle="1">
     <w:name w:val="Compact"/>
     <w:basedOn w:val="BodyText"/>
     <w:qFormat/>
     <w:pPr>
-      <w:spacing w:after="36" w:before="36"/>
+      <w:spacing w:before="36" w:after="36"/>
     </w:pPr>
     <w:rPr/>
   </w:style>
-  <w:style w:styleId="Title" w:type="paragraph">
+  <w:style w:type="paragraph" w:styleId="Title">
     <w:name w:val="Title"/>
     <w:basedOn w:val="Normal"/>
     <w:next w:val="BodyText"/>
@@ -1999,17 +2101,17 @@
     <w:qFormat/>
     <w:rsid w:val="00a10fd9"/>
     <w:pPr>
-      <w:spacing w:after="80" w:before="0"/>
+      <w:spacing w:before="0" w:after="80"/>
       <w:contextualSpacing/>
       <w:jc w:val="center"/>
     </w:pPr>
     <w:rPr>
-      <w:rFonts w:ascii="Aptos Display" w:asciiTheme="majorHAnsi" w:cs="" w:cstheme="majorBidi" w:eastAsia="" w:eastAsiaTheme="majorEastAsia" w:hAnsi="Aptos Display" w:hAnsiTheme="majorHAnsi"/>
+      <w:rFonts w:ascii="Aptos Display" w:hAnsi="Aptos Display" w:eastAsia="" w:cs="" w:asciiTheme="majorHAnsi" w:cstheme="majorBidi" w:eastAsiaTheme="majorEastAsia" w:hAnsiTheme="majorHAnsi"/>
       <w:sz w:val="56"/>
       <w:szCs w:val="56"/>
     </w:rPr>
   </w:style>
-  <w:style w:styleId="Subtitle" w:type="paragraph">
+  <w:style w:type="paragraph" w:styleId="Subtitle">
     <w:name w:val="Subtitle"/>
     <w:basedOn w:val="Title"/>
     <w:next w:val="BodyText"/>
@@ -2024,7 +2126,7 @@
       <w:szCs w:val="28"/>
     </w:rPr>
   </w:style>
-  <w:style w:customStyle="1" w:styleId="Author" w:type="paragraph">
+  <w:style w:type="paragraph" w:styleId="Author" w:customStyle="1">
     <w:name w:val="Author"/>
     <w:basedOn w:val="Title"/>
     <w:next w:val="BodyText"/>
@@ -2038,7 +2140,7 @@
       <w:szCs w:val="24"/>
     </w:rPr>
   </w:style>
-  <w:style w:styleId="Date" w:type="paragraph">
+  <w:style w:type="paragraph" w:styleId="Date">
     <w:name w:val="Date"/>
     <w:basedOn w:val="Title"/>
     <w:next w:val="BodyText"/>
@@ -2052,7 +2154,7 @@
       <w:szCs w:val="24"/>
     </w:rPr>
   </w:style>
-  <w:style w:customStyle="1" w:styleId="AbstractTitle" w:type="paragraph">
+  <w:style w:type="paragraph" w:styleId="AbstractTitle" w:customStyle="1">
     <w:name w:val="Abstract Title"/>
     <w:basedOn w:val="Normal"/>
     <w:next w:val="Abstract"/>
@@ -2060,7 +2162,7 @@
     <w:pPr>
       <w:keepNext w:val="true"/>
       <w:keepLines/>
-      <w:spacing w:after="0" w:before="300"/>
+      <w:spacing w:before="300" w:after="0"/>
       <w:jc w:val="center"/>
     </w:pPr>
     <w:rPr>
@@ -2069,7 +2171,7 @@
       <w:szCs w:val="20"/>
     </w:rPr>
   </w:style>
-  <w:style w:customStyle="1" w:styleId="Abstract" w:type="paragraph">
+  <w:style w:type="paragraph" w:styleId="Abstract" w:customStyle="1">
     <w:name w:val="Abstract"/>
     <w:basedOn w:val="Normal"/>
     <w:next w:val="BodyText"/>
@@ -2077,14 +2179,14 @@
     <w:pPr>
       <w:keepNext w:val="true"/>
       <w:keepLines/>
-      <w:spacing w:after="300" w:before="100"/>
+      <w:spacing w:before="100" w:after="300"/>
     </w:pPr>
     <w:rPr>
       <w:sz w:val="20"/>
       <w:szCs w:val="20"/>
     </w:rPr>
   </w:style>
-  <w:style w:styleId="Bibliography" w:type="paragraph">
+  <w:style w:type="paragraph" w:styleId="Bibliography">
     <w:name w:val="Bibliography"/>
     <w:basedOn w:val="Normal"/>
     <w:qFormat/>
@@ -2095,7 +2197,7 @@
     </w:pPr>
     <w:rPr/>
   </w:style>
-  <w:style w:styleId="BlockText" w:type="paragraph">
+  <w:style w:type="paragraph" w:styleId="BlockText">
     <w:name w:val="Block Text"/>
     <w:basedOn w:val="BodyText"/>
     <w:next w:val="BodyText"/>
@@ -2103,12 +2205,12 @@
     <w:unhideWhenUsed/>
     <w:qFormat/>
     <w:pPr>
-      <w:spacing w:after="100" w:before="100"/>
-      <w:ind w:end="480" w:start="480"/>
+      <w:spacing w:before="100" w:after="100"/>
+      <w:ind w:start="480" w:end="480"/>
     </w:pPr>
     <w:rPr/>
   </w:style>
-  <w:style w:styleId="FootnoteText" w:type="paragraph">
+  <w:style w:type="paragraph" w:styleId="FootnoteText">
     <w:name w:val="footnote text"/>
     <w:basedOn w:val="Normal"/>
     <w:uiPriority w:val="9"/>
@@ -2117,7 +2219,7 @@
     <w:pPr/>
     <w:rPr/>
   </w:style>
-  <w:style w:customStyle="1" w:styleId="FootnoteBlockText" w:type="paragraph">
+  <w:style w:type="paragraph" w:styleId="FootnoteBlockText" w:customStyle="1">
     <w:name w:val="Footnote Block Text"/>
     <w:basedOn w:val="FootnoteText"/>
     <w:next w:val="FootnoteText"/>
@@ -2125,12 +2227,12 @@
     <w:unhideWhenUsed/>
     <w:qFormat/>
     <w:pPr>
-      <w:spacing w:after="100" w:before="100"/>
-      <w:ind w:end="480" w:start="480"/>
+      <w:spacing w:before="100" w:after="100"/>
+      <w:ind w:start="480" w:end="480"/>
     </w:pPr>
     <w:rPr/>
   </w:style>
-  <w:style w:customStyle="1" w:styleId="DefinitionTerm" w:type="paragraph">
+  <w:style w:type="paragraph" w:styleId="DefinitionTerm" w:customStyle="1">
     <w:name w:val="Definition Term"/>
     <w:basedOn w:val="Normal"/>
     <w:next w:val="Definition"/>
@@ -2138,20 +2240,20 @@
     <w:pPr>
       <w:keepNext w:val="true"/>
       <w:keepLines/>
-      <w:spacing w:after="0" w:before="0"/>
+      <w:spacing w:before="0" w:after="0"/>
     </w:pPr>
     <w:rPr>
       <w:b/>
     </w:rPr>
   </w:style>
-  <w:style w:customStyle="1" w:styleId="Definition" w:type="paragraph">
+  <w:style w:type="paragraph" w:styleId="Definition" w:customStyle="1">
     <w:name w:val="Definition"/>
     <w:basedOn w:val="Normal"/>
     <w:qFormat/>
     <w:pPr/>
     <w:rPr/>
   </w:style>
-  <w:style w:customStyle="1" w:styleId="TableCaption" w:type="paragraph">
+  <w:style w:type="paragraph" w:styleId="TableCaption" w:customStyle="1">
     <w:name w:val="Table Caption"/>
     <w:basedOn w:val="Caption"/>
     <w:qFormat/>
@@ -2160,21 +2262,21 @@
     </w:pPr>
     <w:rPr/>
   </w:style>
-  <w:style w:customStyle="1" w:styleId="ImageCaption" w:type="paragraph">
+  <w:style w:type="paragraph" w:styleId="ImageCaption" w:customStyle="1">
     <w:name w:val="Image Caption"/>
     <w:basedOn w:val="Caption"/>
     <w:qFormat/>
     <w:pPr/>
     <w:rPr/>
   </w:style>
-  <w:style w:customStyle="1" w:styleId="Figure" w:type="paragraph">
+  <w:style w:type="paragraph" w:styleId="Figure" w:customStyle="1">
     <w:name w:val="Figure"/>
     <w:basedOn w:val="Normal"/>
     <w:qFormat/>
     <w:pPr/>
     <w:rPr/>
   </w:style>
-  <w:style w:customStyle="1" w:styleId="CaptionedFigure" w:type="paragraph">
+  <w:style w:type="paragraph" w:styleId="CaptionedFigure" w:customStyle="1">
     <w:name w:val="Captioned Figure"/>
     <w:basedOn w:val="Figure"/>
     <w:qFormat/>
@@ -2183,13 +2285,13 @@
     </w:pPr>
     <w:rPr/>
   </w:style>
-  <w:style w:styleId="IndexHeading" w:type="paragraph">
+  <w:style w:type="paragraph" w:styleId="IndexHeading">
     <w:name w:val="index heading"/>
     <w:basedOn w:val="Heading"/>
     <w:pPr/>
     <w:rPr/>
   </w:style>
-  <w:style w:styleId="TOCHeading" w:type="paragraph">
+  <w:style w:type="paragraph" w:styleId="TOCHeading">
     <w:name w:val="TOC Heading"/>
     <w:basedOn w:val="Heading1"/>
     <w:next w:val="BodyText"/>
@@ -2197,22 +2299,22 @@
     <w:unhideWhenUsed/>
     <w:qFormat/>
     <w:pPr>
-      <w:spacing w:after="240" w:before="240" w:line="259" w:lineRule="auto"/>
+      <w:spacing w:lineRule="auto" w:line="259" w:before="240" w:after="240"/>
       <w:outlineLvl w:val="9"/>
     </w:pPr>
     <w:rPr/>
   </w:style>
-  <w:style w:customStyle="1" w:styleId="SourceCode" w:type="paragraph">
+  <w:style w:type="paragraph" w:styleId="SourceCode" w:customStyle="1">
     <w:name w:val="Source Code"/>
     <w:basedOn w:val="Normal"/>
     <w:link w:val="VerbatimChar"/>
     <w:qFormat/>
     <w:pPr>
-      <w:shd w:color="auto" w:fill="F1F3F5" w:val="clear"/>
+      <w:shd w:val="clear" w:color="auto" w:fill="F1F3F5"/>
     </w:pPr>
     <w:rPr/>
   </w:style>
-  <w:style w:styleId="TOC1" w:type="paragraph">
+  <w:style w:type="paragraph" w:styleId="TOC1">
     <w:name w:val="toc 1"/>
     <w:basedOn w:val="Normal"/>
     <w:next w:val="Normal"/>
@@ -2220,11 +2322,11 @@
     <w:uiPriority w:val="39"/>
     <w:rsid w:val="00fe7c35"/>
     <w:pPr>
-      <w:spacing w:after="100" w:before="0"/>
+      <w:spacing w:before="0" w:after="100"/>
     </w:pPr>
     <w:rPr/>
   </w:style>
-  <w:style w:styleId="TOC2" w:type="paragraph">
+  <w:style w:type="paragraph" w:styleId="TOC2">
     <w:name w:val="toc 2"/>
     <w:basedOn w:val="Normal"/>
     <w:next w:val="Normal"/>
@@ -2232,12 +2334,12 @@
     <w:uiPriority w:val="39"/>
     <w:rsid w:val="00fe7c35"/>
     <w:pPr>
-      <w:spacing w:after="100" w:before="0"/>
+      <w:spacing w:before="0" w:after="100"/>
       <w:ind w:start="240"/>
     </w:pPr>
     <w:rPr/>
   </w:style>
-  <w:style w:styleId="TOC3" w:type="paragraph">
+  <w:style w:type="paragraph" w:styleId="TOC3">
     <w:name w:val="toc 3"/>
     <w:basedOn w:val="Normal"/>
     <w:next w:val="Normal"/>
@@ -2245,87 +2347,87 @@
     <w:uiPriority w:val="39"/>
     <w:rsid w:val="00fe7c35"/>
     <w:pPr>
-      <w:spacing w:after="100" w:before="0"/>
+      <w:spacing w:before="0" w:after="100"/>
       <w:ind w:start="480"/>
     </w:pPr>
     <w:rPr/>
   </w:style>
-  <w:style w:styleId="HeaderandFooter" w:type="paragraph">
+  <w:style w:type="paragraph" w:styleId="HeaderandFooter">
     <w:name w:val="Header and Footer"/>
     <w:basedOn w:val="Normal"/>
     <w:qFormat/>
     <w:pPr/>
     <w:rPr/>
   </w:style>
-  <w:style w:styleId="Header" w:type="paragraph">
+  <w:style w:type="paragraph" w:styleId="Header">
     <w:name w:val="header"/>
     <w:basedOn w:val="Normal"/>
     <w:link w:val="HeaderChar"/>
     <w:rsid w:val="00803c7e"/>
     <w:pPr>
       <w:tabs>
-        <w:tab w:pos="720" w:val="clear"/>
-        <w:tab w:leader="none" w:pos="4680" w:val="center"/>
-        <w:tab w:leader="none" w:pos="9360" w:val="right"/>
+        <w:tab w:val="clear" w:pos="720"/>
+        <w:tab w:val="center" w:pos="4680" w:leader="none"/>
+        <w:tab w:val="right" w:pos="9360" w:leader="none"/>
       </w:tabs>
-      <w:spacing w:after="0" w:before="0"/>
+      <w:spacing w:before="0" w:after="0"/>
     </w:pPr>
     <w:rPr/>
   </w:style>
-  <w:style w:styleId="Footer" w:type="paragraph">
+  <w:style w:type="paragraph" w:styleId="Footer">
     <w:name w:val="footer"/>
     <w:basedOn w:val="Normal"/>
     <w:link w:val="FooterChar"/>
     <w:rsid w:val="00803c7e"/>
     <w:pPr>
       <w:tabs>
-        <w:tab w:pos="720" w:val="clear"/>
-        <w:tab w:leader="none" w:pos="4680" w:val="center"/>
-        <w:tab w:leader="none" w:pos="9360" w:val="right"/>
+        <w:tab w:val="clear" w:pos="720"/>
+        <w:tab w:val="center" w:pos="4680" w:leader="none"/>
+        <w:tab w:val="right" w:pos="9360" w:leader="none"/>
       </w:tabs>
-      <w:spacing w:after="0" w:before="0"/>
+      <w:spacing w:before="0" w:after="0"/>
     </w:pPr>
     <w:rPr/>
   </w:style>
-  <w:style w:default="1" w:styleId="NoList" w:type="numbering">
+  <w:style w:type="numbering" w:styleId="NoList" w:default="1">
     <w:name w:val="No List"/>
     <w:uiPriority w:val="99"/>
     <w:semiHidden/>
     <w:unhideWhenUsed/>
     <w:qFormat/>
   </w:style>
-  <w:style w:default="1" w:styleId="TableNormal" w:type="table">
+  <w:style w:type="table" w:default="1" w:styleId="TableNormal">
     <w:name w:val="Normal Table"/>
     <w:uiPriority w:val="99"/>
     <w:semiHidden/>
     <w:unhideWhenUsed/>
     <w:tblPr>
       <w:tblCellMar>
-        <w:top w:type="dxa" w:w="0"/>
-        <w:left w:type="dxa" w:w="108"/>
-        <w:bottom w:type="dxa" w:w="0"/>
-        <w:right w:type="dxa" w:w="108"/>
+        <w:top w:w="0" w:type="dxa"/>
+        <w:left w:w="108" w:type="dxa"/>
+        <w:bottom w:w="0" w:type="dxa"/>
+        <w:right w:w="108" w:type="dxa"/>
       </w:tblCellMar>
     </w:tblPr>
   </w:style>
-  <w:style w:customStyle="1" w:styleId="Table" w:type="table">
+  <w:style w:type="table" w:customStyle="1" w:styleId="Table">
     <w:name w:val="Table"/>
     <w:semiHidden/>
     <w:unhideWhenUsed/>
     <w:qFormat/>
     <w:tblPr>
       <w:tblCellMar>
-        <w:top w:type="dxa" w:w="0"/>
-        <w:left w:type="dxa" w:w="108"/>
-        <w:bottom w:type="dxa" w:w="0"/>
-        <w:right w:type="dxa" w:w="108"/>
+        <w:top w:w="0" w:type="dxa"/>
+        <w:left w:w="108" w:type="dxa"/>
+        <w:bottom w:w="0" w:type="dxa"/>
+        <w:right w:w="108" w:type="dxa"/>
       </w:tblCellMar>
     </w:tblPr>
     <w:tblStylePr w:type="firstRow">
       <w:tblPr/>
       <w:tcPr>
         <w:tcBorders>
-          <w:bottom w:color="auto" w:space="0" w:sz="0" w:val="single"/>
+          <w:bottom w:val="single" w:color="auto" w:sz="0" w:space="0"/>
         </w:tcBorders>
         <w:vAlign w:val="bottom"/>
       </w:tcPr>

</xml_diff>